<commit_message>
Add learning dashboard, charts, and Day 1–2 curated resources
Continue Day 2 on the same calendar date (no new numbered day): Section 0
visual dashboard with evidence-honest charts, LEARNING RESOURCES for Days
1–2, and Section 11 resource tracking log.

Co-authored-by: Rmohit21 <Rmohit21@users.noreply.github.com>
</commit_message>
<xml_diff>
--- a/Modern_FullStack_Skill_Growth_Journal.docx
+++ b/Modern_FullStack_Skill_Growth_Journal.docx
@@ -537,6 +537,1320 @@
         <w:br w:type="page"/>
       </w:r>
     </w:p>
+    <w:p>
+      <w:pPr>
+        <w:pStyle w:val="Heading1"/>
+      </w:pPr>
+      <w:r>
+        <w:rPr>
+          <w:rFonts w:ascii="Calibri" w:hAnsi="Calibri" w:cs="Calibri"/>
+          <w:b/>
+          <w:color w:val="1B365D"/>
+          <w:sz w:val="32"/>
+        </w:rPr>
+        <w:t>Section 0 — Learning Dashboard</w:t>
+      </w:r>
+    </w:p>
+    <w:p>
+      <w:pPr/>
+      <w:r>
+        <w:rPr>
+          <w:rFonts w:ascii="Calibri" w:hAnsi="Calibri" w:cs="Calibri"/>
+          <w:b w:val="0"/>
+          <w:i w:val="0"/>
+          <w:color w:val="334155"/>
+          <w:sz w:val="22"/>
+        </w:rPr>
+        <w:t>Visual summary only. Underlying tables in Sections 2–8 remain the source of truth. Charts never invent progress. Reading resources does not change skill levels.</w:t>
+      </w:r>
+    </w:p>
+    <w:p>
+      <w:pPr/>
+      <w:r>
+        <w:rPr>
+          <w:rFonts w:ascii="Calibri" w:hAnsi="Calibri" w:cs="Calibri"/>
+          <w:b w:val="0"/>
+          <w:i w:val="0"/>
+          <w:color w:val="334155"/>
+          <w:sz w:val="22"/>
+        </w:rPr>
+        <w:t>Calendar rule (locked): one calendar date = at most one new numbered learning day. This update is 2026-09-10 continuation of Day 2 (resources + dashboard) — not Day 3.</w:t>
+      </w:r>
+    </w:p>
+    <w:p>
+      <w:pPr>
+        <w:pStyle w:val="Heading2"/>
+      </w:pPr>
+      <w:r>
+        <w:rPr>
+          <w:rFonts w:ascii="Calibri" w:hAnsi="Calibri" w:cs="Calibri"/>
+          <w:b/>
+          <w:color w:val="1B365D"/>
+          <w:sz w:val="28"/>
+        </w:rPr>
+        <w:t>Snapshot</w:t>
+      </w:r>
+    </w:p>
+    <w:tbl>
+      <w:tblPr>
+        <w:tblStyle w:val="TableGrid"/>
+        <w:tblW w:type="auto" w:w="0"/>
+        <w:tblLook w:firstColumn="1" w:firstRow="1" w:lastColumn="0" w:lastRow="0" w:noHBand="0" w:noVBand="1" w:val="04A0"/>
+      </w:tblPr>
+      <w:tblGrid>
+        <w:gridCol w:w="4706"/>
+        <w:gridCol w:w="4706"/>
+      </w:tblGrid>
+      <w:tr>
+        <w:tc>
+          <w:tcPr>
+            <w:tcW w:type="dxa" w:w="4706"/>
+            <w:shd w:fill="1B365D" w:val="clear"/>
+          </w:tcPr>
+          <w:p>
+            <w:r>
+              <w:rPr>
+                <w:rFonts w:ascii="Calibri" w:hAnsi="Calibri" w:cs="Calibri"/>
+                <w:b/>
+                <w:color w:val="FFFFFF"/>
+                <w:sz w:val="16"/>
+              </w:rPr>
+              <w:t>Field</w:t>
+            </w:r>
+          </w:p>
+        </w:tc>
+        <w:tc>
+          <w:tcPr>
+            <w:tcW w:type="dxa" w:w="4706"/>
+            <w:shd w:fill="1B365D" w:val="clear"/>
+          </w:tcPr>
+          <w:p>
+            <w:r>
+              <w:rPr>
+                <w:rFonts w:ascii="Calibri" w:hAnsi="Calibri" w:cs="Calibri"/>
+                <w:b/>
+                <w:color w:val="FFFFFF"/>
+                <w:sz w:val="16"/>
+              </w:rPr>
+              <w:t>Value</w:t>
+            </w:r>
+          </w:p>
+        </w:tc>
+      </w:tr>
+      <w:tr>
+        <w:tc>
+          <w:tcPr>
+            <w:tcW w:type="dxa" w:w="4706"/>
+          </w:tcPr>
+          <w:p>
+            <w:r>
+              <w:rPr>
+                <w:rFonts w:ascii="Calibri" w:hAnsi="Calibri" w:cs="Calibri"/>
+                <w:b w:val="0"/>
+                <w:color w:val="334155"/>
+                <w:sz w:val="16"/>
+              </w:rPr>
+              <w:t>Current Day</w:t>
+            </w:r>
+          </w:p>
+        </w:tc>
+        <w:tc>
+          <w:tcPr>
+            <w:tcW w:type="dxa" w:w="4706"/>
+          </w:tcPr>
+          <w:p>
+            <w:r>
+              <w:rPr>
+                <w:rFonts w:ascii="Calibri" w:hAnsi="Calibri" w:cs="Calibri"/>
+                <w:b w:val="0"/>
+                <w:color w:val="334155"/>
+                <w:sz w:val="16"/>
+              </w:rPr>
+              <w:t>Day 2 (continue — same calendar date as Day 1)</w:t>
+            </w:r>
+          </w:p>
+        </w:tc>
+      </w:tr>
+      <w:tr>
+        <w:tc>
+          <w:tcPr>
+            <w:tcW w:type="dxa" w:w="4706"/>
+          </w:tcPr>
+          <w:p>
+            <w:r>
+              <w:rPr>
+                <w:rFonts w:ascii="Calibri" w:hAnsi="Calibri" w:cs="Calibri"/>
+                <w:b w:val="0"/>
+                <w:color w:val="334155"/>
+                <w:sz w:val="16"/>
+              </w:rPr>
+              <w:t>Current Week</w:t>
+            </w:r>
+          </w:p>
+        </w:tc>
+        <w:tc>
+          <w:tcPr>
+            <w:tcW w:type="dxa" w:w="4706"/>
+          </w:tcPr>
+          <w:p>
+            <w:r>
+              <w:rPr>
+                <w:rFonts w:ascii="Calibri" w:hAnsi="Calibri" w:cs="Calibri"/>
+                <w:b w:val="0"/>
+                <w:color w:val="334155"/>
+                <w:sz w:val="16"/>
+              </w:rPr>
+              <w:t>Week 1</w:t>
+            </w:r>
+          </w:p>
+        </w:tc>
+      </w:tr>
+      <w:tr>
+        <w:tc>
+          <w:tcPr>
+            <w:tcW w:type="dxa" w:w="4706"/>
+          </w:tcPr>
+          <w:p>
+            <w:r>
+              <w:rPr>
+                <w:rFonts w:ascii="Calibri" w:hAnsi="Calibri" w:cs="Calibri"/>
+                <w:b w:val="0"/>
+                <w:color w:val="334155"/>
+                <w:sz w:val="16"/>
+              </w:rPr>
+              <w:t>Current Phase</w:t>
+            </w:r>
+          </w:p>
+        </w:tc>
+        <w:tc>
+          <w:tcPr>
+            <w:tcW w:type="dxa" w:w="4706"/>
+          </w:tcPr>
+          <w:p>
+            <w:r>
+              <w:rPr>
+                <w:rFonts w:ascii="Calibri" w:hAnsi="Calibri" w:cs="Calibri"/>
+                <w:b w:val="0"/>
+                <w:color w:val="334155"/>
+                <w:sz w:val="16"/>
+              </w:rPr>
+              <w:t>FOUNDATION</w:t>
+            </w:r>
+          </w:p>
+        </w:tc>
+      </w:tr>
+      <w:tr>
+        <w:tc>
+          <w:tcPr>
+            <w:tcW w:type="dxa" w:w="4706"/>
+          </w:tcPr>
+          <w:p>
+            <w:r>
+              <w:rPr>
+                <w:rFonts w:ascii="Calibri" w:hAnsi="Calibri" w:cs="Calibri"/>
+                <w:b w:val="0"/>
+                <w:color w:val="334155"/>
+                <w:sz w:val="16"/>
+              </w:rPr>
+              <w:t>Current Project</w:t>
+            </w:r>
+          </w:p>
+        </w:tc>
+        <w:tc>
+          <w:tcPr>
+            <w:tcW w:type="dxa" w:w="4706"/>
+          </w:tcPr>
+          <w:p>
+            <w:r>
+              <w:rPr>
+                <w:rFonts w:ascii="Calibri" w:hAnsi="Calibri" w:cs="Calibri"/>
+                <w:b w:val="0"/>
+                <w:color w:val="334155"/>
+                <w:sz w:val="16"/>
+              </w:rPr>
+              <w:t>ForgeBoard — types + runtime parser (no Next.js yet)</w:t>
+            </w:r>
+          </w:p>
+        </w:tc>
+      </w:tr>
+      <w:tr>
+        <w:tc>
+          <w:tcPr>
+            <w:tcW w:type="dxa" w:w="4706"/>
+          </w:tcPr>
+          <w:p>
+            <w:r>
+              <w:rPr>
+                <w:rFonts w:ascii="Calibri" w:hAnsi="Calibri" w:cs="Calibri"/>
+                <w:b w:val="0"/>
+                <w:color w:val="334155"/>
+                <w:sz w:val="16"/>
+              </w:rPr>
+              <w:t>Overall learning status</w:t>
+            </w:r>
+          </w:p>
+        </w:tc>
+        <w:tc>
+          <w:tcPr>
+            <w:tcW w:type="dxa" w:w="4706"/>
+          </w:tcPr>
+          <w:p>
+            <w:r>
+              <w:rPr>
+                <w:rFonts w:ascii="Calibri" w:hAnsi="Calibri" w:cs="Calibri"/>
+                <w:b w:val="0"/>
+                <w:color w:val="334155"/>
+                <w:sz w:val="16"/>
+              </w:rPr>
+              <w:t>Assigned lessons exist; implementation evidence = NONE</w:t>
+            </w:r>
+          </w:p>
+        </w:tc>
+      </w:tr>
+      <w:tr>
+        <w:tc>
+          <w:tcPr>
+            <w:tcW w:type="dxa" w:w="4706"/>
+          </w:tcPr>
+          <w:p>
+            <w:r>
+              <w:rPr>
+                <w:rFonts w:ascii="Calibri" w:hAnsi="Calibri" w:cs="Calibri"/>
+                <w:b w:val="0"/>
+                <w:color w:val="334155"/>
+                <w:sz w:val="16"/>
+              </w:rPr>
+              <w:t>Mode</w:t>
+            </w:r>
+          </w:p>
+        </w:tc>
+        <w:tc>
+          <w:tcPr>
+            <w:tcW w:type="dxa" w:w="4706"/>
+          </w:tcPr>
+          <w:p>
+            <w:r>
+              <w:rPr>
+                <w:rFonts w:ascii="Calibri" w:hAnsi="Calibri" w:cs="Calibri"/>
+                <w:b w:val="0"/>
+                <w:color w:val="334155"/>
+                <w:sz w:val="16"/>
+              </w:rPr>
+              <w:t>DAILY MODE (Deep Dive Mode idle until explicitly requested)</w:t>
+            </w:r>
+          </w:p>
+        </w:tc>
+      </w:tr>
+      <w:tr>
+        <w:tc>
+          <w:tcPr>
+            <w:tcW w:type="dxa" w:w="4706"/>
+          </w:tcPr>
+          <w:p>
+            <w:r>
+              <w:rPr>
+                <w:rFonts w:ascii="Calibri" w:hAnsi="Calibri" w:cs="Calibri"/>
+                <w:b w:val="0"/>
+                <w:color w:val="334155"/>
+                <w:sz w:val="16"/>
+              </w:rPr>
+              <w:t>Current milestone</w:t>
+            </w:r>
+          </w:p>
+        </w:tc>
+        <w:tc>
+          <w:tcPr>
+            <w:tcW w:type="dxa" w:w="4706"/>
+          </w:tcPr>
+          <w:p>
+            <w:r>
+              <w:rPr>
+                <w:rFonts w:ascii="Calibri" w:hAnsi="Calibri" w:cs="Calibri"/>
+                <w:b w:val="0"/>
+                <w:color w:val="334155"/>
+                <w:sz w:val="16"/>
+              </w:rPr>
+              <w:t>Hand-rolled parseCreateIssue + ParseResult with tests</w:t>
+            </w:r>
+          </w:p>
+        </w:tc>
+      </w:tr>
+      <w:tr>
+        <w:tc>
+          <w:tcPr>
+            <w:tcW w:type="dxa" w:w="4706"/>
+          </w:tcPr>
+          <w:p>
+            <w:r>
+              <w:rPr>
+                <w:rFonts w:ascii="Calibri" w:hAnsi="Calibri" w:cs="Calibri"/>
+                <w:b w:val="0"/>
+                <w:color w:val="334155"/>
+                <w:sz w:val="16"/>
+              </w:rPr>
+              <w:t>Next milestone</w:t>
+            </w:r>
+          </w:p>
+        </w:tc>
+        <w:tc>
+          <w:tcPr>
+            <w:tcW w:type="dxa" w:w="4706"/>
+          </w:tcPr>
+          <w:p>
+            <w:r>
+              <w:rPr>
+                <w:rFonts w:ascii="Calibri" w:hAnsi="Calibri" w:cs="Calibri"/>
+                <w:b w:val="0"/>
+                <w:color w:val="334155"/>
+                <w:sz w:val="16"/>
+              </w:rPr>
+              <w:t>Day 3 (next calendar day): event loop + async/await in handlers</w:t>
+            </w:r>
+          </w:p>
+        </w:tc>
+      </w:tr>
+      <w:tr>
+        <w:tc>
+          <w:tcPr>
+            <w:tcW w:type="dxa" w:w="4706"/>
+          </w:tcPr>
+          <w:p>
+            <w:r>
+              <w:rPr>
+                <w:rFonts w:ascii="Calibri" w:hAnsi="Calibri" w:cs="Calibri"/>
+                <w:b w:val="0"/>
+                <w:color w:val="334155"/>
+                <w:sz w:val="16"/>
+              </w:rPr>
+              <w:t>Weak areas (matrix)</w:t>
+            </w:r>
+          </w:p>
+        </w:tc>
+        <w:tc>
+          <w:tcPr>
+            <w:tcW w:type="dxa" w:w="4706"/>
+          </w:tcPr>
+          <w:p>
+            <w:r>
+              <w:rPr>
+                <w:rFonts w:ascii="Calibri" w:hAnsi="Calibri" w:cs="Calibri"/>
+                <w:b w:val="0"/>
+                <w:color w:val="334155"/>
+                <w:sz w:val="16"/>
+              </w:rPr>
+              <w:t>TypeScript, React/Next, HTTP, Node, auth, Docker, cloud, testing (all 🔴 or unverified)</w:t>
+            </w:r>
+          </w:p>
+        </w:tc>
+      </w:tr>
+      <w:tr>
+        <w:tc>
+          <w:tcPr>
+            <w:tcW w:type="dxa" w:w="4706"/>
+          </w:tcPr>
+          <w:p>
+            <w:r>
+              <w:rPr>
+                <w:rFonts w:ascii="Calibri" w:hAnsi="Calibri" w:cs="Calibri"/>
+                <w:b w:val="0"/>
+                <w:color w:val="334155"/>
+                <w:sz w:val="16"/>
+              </w:rPr>
+              <w:t>Strong areas (matrix)</w:t>
+            </w:r>
+          </w:p>
+        </w:tc>
+        <w:tc>
+          <w:tcPr>
+            <w:tcW w:type="dxa" w:w="4706"/>
+          </w:tcPr>
+          <w:p>
+            <w:r>
+              <w:rPr>
+                <w:rFonts w:ascii="Calibri" w:hAnsi="Calibri" w:cs="Calibri"/>
+                <w:b w:val="0"/>
+                <w:color w:val="334155"/>
+                <w:sz w:val="16"/>
+              </w:rPr>
+              <w:t>None evidenced as 🟢 in this journal</w:t>
+            </w:r>
+          </w:p>
+        </w:tc>
+      </w:tr>
+      <w:tr>
+        <w:tc>
+          <w:tcPr>
+            <w:tcW w:type="dxa" w:w="4706"/>
+          </w:tcPr>
+          <w:p>
+            <w:r>
+              <w:rPr>
+                <w:rFonts w:ascii="Calibri" w:hAnsi="Calibri" w:cs="Calibri"/>
+                <w:b w:val="0"/>
+                <w:color w:val="334155"/>
+                <w:sz w:val="16"/>
+              </w:rPr>
+              <w:t>Topics completed (evidenced)</w:t>
+            </w:r>
+          </w:p>
+        </w:tc>
+        <w:tc>
+          <w:tcPr>
+            <w:tcW w:type="dxa" w:w="4706"/>
+          </w:tcPr>
+          <w:p>
+            <w:r>
+              <w:rPr>
+                <w:rFonts w:ascii="Calibri" w:hAnsi="Calibri" w:cs="Calibri"/>
+                <w:b w:val="0"/>
+                <w:color w:val="334155"/>
+                <w:sz w:val="16"/>
+              </w:rPr>
+              <w:t>0</w:t>
+            </w:r>
+          </w:p>
+        </w:tc>
+      </w:tr>
+      <w:tr>
+        <w:tc>
+          <w:tcPr>
+            <w:tcW w:type="dxa" w:w="4706"/>
+          </w:tcPr>
+          <w:p>
+            <w:r>
+              <w:rPr>
+                <w:rFonts w:ascii="Calibri" w:hAnsi="Calibri" w:cs="Calibri"/>
+                <w:b w:val="0"/>
+                <w:color w:val="334155"/>
+                <w:sz w:val="16"/>
+              </w:rPr>
+              <w:t>Topics in progress (assigned)</w:t>
+            </w:r>
+          </w:p>
+        </w:tc>
+        <w:tc>
+          <w:tcPr>
+            <w:tcW w:type="dxa" w:w="4706"/>
+          </w:tcPr>
+          <w:p>
+            <w:r>
+              <w:rPr>
+                <w:rFonts w:ascii="Calibri" w:hAnsi="Calibri" w:cs="Calibri"/>
+                <w:b w:val="0"/>
+                <w:color w:val="334155"/>
+                <w:sz w:val="16"/>
+              </w:rPr>
+              <w:t>Day 1 structural typing · Day 2 runtime validation</w:t>
+            </w:r>
+          </w:p>
+        </w:tc>
+      </w:tr>
+      <w:tr>
+        <w:tc>
+          <w:tcPr>
+            <w:tcW w:type="dxa" w:w="4706"/>
+          </w:tcPr>
+          <w:p>
+            <w:r>
+              <w:rPr>
+                <w:rFonts w:ascii="Calibri" w:hAnsi="Calibri" w:cs="Calibri"/>
+                <w:b w:val="0"/>
+                <w:color w:val="334155"/>
+                <w:sz w:val="16"/>
+              </w:rPr>
+              <w:t>Topics not started</w:t>
+            </w:r>
+          </w:p>
+        </w:tc>
+        <w:tc>
+          <w:tcPr>
+            <w:tcW w:type="dxa" w:w="4706"/>
+          </w:tcPr>
+          <w:p>
+            <w:r>
+              <w:rPr>
+                <w:rFonts w:ascii="Calibri" w:hAnsi="Calibri" w:cs="Calibri"/>
+                <w:b w:val="0"/>
+                <w:color w:val="334155"/>
+                <w:sz w:val="16"/>
+              </w:rPr>
+              <w:t>Event loop, HTTP, Next.js App Router, PostgreSQL schema, Docker, …</w:t>
+            </w:r>
+          </w:p>
+        </w:tc>
+      </w:tr>
+    </w:tbl>
+    <w:p>
+      <w:pPr>
+        <w:pStyle w:val="Heading2"/>
+      </w:pPr>
+      <w:r>
+        <w:rPr>
+          <w:rFonts w:ascii="Calibri" w:hAnsi="Calibri" w:cs="Calibri"/>
+          <w:b/>
+          <w:color w:val="1B365D"/>
+          <w:sz w:val="28"/>
+        </w:rPr>
+        <w:t>Chart 1 — Skill Status</w:t>
+      </w:r>
+    </w:p>
+    <w:p>
+      <w:pPr/>
+      <w:r>
+        <w:rPr>
+          <w:rFonts w:ascii="Calibri" w:hAnsi="Calibri" w:cs="Calibri"/>
+          <w:b w:val="0"/>
+          <w:i w:val="0"/>
+          <w:color w:val="334155"/>
+          <w:sz w:val="22"/>
+        </w:rPr>
+        <w:t>Counts from Section 2 Skill Matrix only: Weak = 19, Developing = 3, Strong = 0. Developing rows are prior-exposure asterisks (PostgreSQL / DSA / AI theory) — not ForgeBoard evidence.</w:t>
+      </w:r>
+    </w:p>
+    <w:p>
+      <w:pPr/>
+      <w:r>
+        <w:drawing>
+          <wp:inline xmlns:a="http://schemas.openxmlformats.org/drawingml/2006/main" xmlns:pic="http://schemas.openxmlformats.org/drawingml/2006/picture">
+            <wp:extent cx="5669280" cy="2834640"/>
+            <wp:docPr id="1" name="Picture 1"/>
+            <wp:cNvGraphicFramePr>
+              <a:graphicFrameLocks noChangeAspect="1"/>
+            </wp:cNvGraphicFramePr>
+            <a:graphic>
+              <a:graphicData uri="http://schemas.openxmlformats.org/drawingml/2006/picture">
+                <pic:pic>
+                  <pic:nvPicPr>
+                    <pic:cNvPr id="0" name="chart1_skill_status.png"/>
+                    <pic:cNvPicPr/>
+                  </pic:nvPicPr>
+                  <pic:blipFill>
+                    <a:blip r:embed="rId11"/>
+                    <a:stretch>
+                      <a:fillRect/>
+                    </a:stretch>
+                  </pic:blipFill>
+                  <pic:spPr>
+                    <a:xfrm>
+                      <a:off x="0" y="0"/>
+                      <a:ext cx="5669280" cy="2834640"/>
+                    </a:xfrm>
+                    <a:prstGeom prst="rect"/>
+                  </pic:spPr>
+                </pic:pic>
+              </a:graphicData>
+            </a:graphic>
+          </wp:inline>
+        </w:drawing>
+      </w:r>
+    </w:p>
+    <w:p>
+      <w:pPr>
+        <w:pStyle w:val="Heading2"/>
+      </w:pPr>
+      <w:r>
+        <w:rPr>
+          <w:rFonts w:ascii="Calibri" w:hAnsi="Calibri" w:cs="Calibri"/>
+          <w:b/>
+          <w:color w:val="1B365D"/>
+          <w:sz w:val="28"/>
+        </w:rPr>
+        <w:t>Chart 2 — Skill Progress by Domain</w:t>
+      </w:r>
+    </w:p>
+    <w:p>
+      <w:pPr/>
+      <w:r>
+        <w:rPr>
+          <w:rFonts w:ascii="Calibri" w:hAnsi="Calibri" w:cs="Calibri"/>
+          <w:b w:val="0"/>
+          <w:i w:val="0"/>
+          <w:color w:val="334155"/>
+          <w:sz w:val="22"/>
+        </w:rPr>
+        <w:t>Insufficient evidence. No completed build tasks, quizzes, or learner notes have been recorded. Assigned ≠ progress. Percentages are intentionally not shown.</w:t>
+      </w:r>
+    </w:p>
+    <w:p>
+      <w:pPr/>
+      <w:r>
+        <w:drawing>
+          <wp:inline xmlns:a="http://schemas.openxmlformats.org/drawingml/2006/main" xmlns:pic="http://schemas.openxmlformats.org/drawingml/2006/picture">
+            <wp:extent cx="5852160" cy="2616260"/>
+            <wp:docPr id="2" name="Picture 2"/>
+            <wp:cNvGraphicFramePr>
+              <a:graphicFrameLocks noChangeAspect="1"/>
+            </wp:cNvGraphicFramePr>
+            <a:graphic>
+              <a:graphicData uri="http://schemas.openxmlformats.org/drawingml/2006/picture">
+                <pic:pic>
+                  <pic:nvPicPr>
+                    <pic:cNvPr id="0" name="chart2_domain_progress.png"/>
+                    <pic:cNvPicPr/>
+                  </pic:nvPicPr>
+                  <pic:blipFill>
+                    <a:blip r:embed="rId12"/>
+                    <a:stretch>
+                      <a:fillRect/>
+                    </a:stretch>
+                  </pic:blipFill>
+                  <pic:spPr>
+                    <a:xfrm>
+                      <a:off x="0" y="0"/>
+                      <a:ext cx="5852160" cy="2616260"/>
+                    </a:xfrm>
+                    <a:prstGeom prst="rect"/>
+                  </pic:spPr>
+                </pic:pic>
+              </a:graphicData>
+            </a:graphic>
+          </wp:inline>
+        </w:drawing>
+      </w:r>
+    </w:p>
+    <w:p>
+      <w:pPr>
+        <w:pStyle w:val="Heading2"/>
+      </w:pPr>
+      <w:r>
+        <w:rPr>
+          <w:rFonts w:ascii="Calibri" w:hAnsi="Calibri" w:cs="Calibri"/>
+          <w:b/>
+          <w:color w:val="1B365D"/>
+          <w:sz w:val="28"/>
+        </w:rPr>
+        <w:t>Chart 3 — Learning Trend</w:t>
+      </w:r>
+    </w:p>
+    <w:p>
+      <w:pPr/>
+      <w:r>
+        <w:rPr>
+          <w:rFonts w:ascii="Calibri" w:hAnsi="Calibri" w:cs="Calibri"/>
+          <w:b w:val="0"/>
+          <w:i w:val="0"/>
+          <w:color w:val="334155"/>
+          <w:sz w:val="22"/>
+        </w:rPr>
+        <w:t>Insufficient historical data. A weekly trend requires completed topics / builds / DSA solves across multiple weeks. First weekly review is scheduled near Day 7.</w:t>
+      </w:r>
+    </w:p>
+    <w:p>
+      <w:pPr/>
+      <w:r>
+        <w:drawing>
+          <wp:inline xmlns:a="http://schemas.openxmlformats.org/drawingml/2006/main" xmlns:pic="http://schemas.openxmlformats.org/drawingml/2006/picture">
+            <wp:extent cx="5669280" cy="2418893"/>
+            <wp:docPr id="3" name="Picture 3"/>
+            <wp:cNvGraphicFramePr>
+              <a:graphicFrameLocks noChangeAspect="1"/>
+            </wp:cNvGraphicFramePr>
+            <a:graphic>
+              <a:graphicData uri="http://schemas.openxmlformats.org/drawingml/2006/picture">
+                <pic:pic>
+                  <pic:nvPicPr>
+                    <pic:cNvPr id="0" name="chart3_learning_trend.png"/>
+                    <pic:cNvPicPr/>
+                  </pic:nvPicPr>
+                  <pic:blipFill>
+                    <a:blip r:embed="rId13"/>
+                    <a:stretch>
+                      <a:fillRect/>
+                    </a:stretch>
+                  </pic:blipFill>
+                  <pic:spPr>
+                    <a:xfrm>
+                      <a:off x="0" y="0"/>
+                      <a:ext cx="5669280" cy="2418893"/>
+                    </a:xfrm>
+                    <a:prstGeom prst="rect"/>
+                  </pic:spPr>
+                </pic:pic>
+              </a:graphicData>
+            </a:graphic>
+          </wp:inline>
+        </w:drawing>
+      </w:r>
+    </w:p>
+    <w:p>
+      <w:pPr>
+        <w:pStyle w:val="Heading2"/>
+      </w:pPr>
+      <w:r>
+        <w:rPr>
+          <w:rFonts w:ascii="Calibri" w:hAnsi="Calibri" w:cs="Calibri"/>
+          <w:b/>
+          <w:color w:val="1B365D"/>
+          <w:sz w:val="28"/>
+        </w:rPr>
+        <w:t>Roadmap Visualization</w:t>
+      </w:r>
+    </w:p>
+    <w:p>
+      <w:pPr/>
+      <w:r>
+        <w:rPr>
+          <w:rFonts w:ascii="Calibri" w:hAnsi="Calibri" w:cs="Calibri"/>
+          <w:b w:val="0"/>
+          <w:i w:val="0"/>
+          <w:color w:val="334155"/>
+          <w:sz w:val="22"/>
+        </w:rPr>
+        <w:t>Legend: ✓ Completed (demonstrated) · ◐ In progress (assigned/started) · ○ Not started. Foundation is ◐ because Days 1–2 are assigned, not because they are mastered.</w:t>
+      </w:r>
+    </w:p>
+    <w:p>
+      <w:pPr/>
+      <w:r>
+        <w:drawing>
+          <wp:inline xmlns:a="http://schemas.openxmlformats.org/drawingml/2006/main" xmlns:pic="http://schemas.openxmlformats.org/drawingml/2006/picture">
+            <wp:extent cx="5303520" cy="3677107"/>
+            <wp:docPr id="4" name="Picture 4"/>
+            <wp:cNvGraphicFramePr>
+              <a:graphicFrameLocks noChangeAspect="1"/>
+            </wp:cNvGraphicFramePr>
+            <a:graphic>
+              <a:graphicData uri="http://schemas.openxmlformats.org/drawingml/2006/picture">
+                <pic:pic>
+                  <pic:nvPicPr>
+                    <pic:cNvPr id="0" name="chart_roadmap.png"/>
+                    <pic:cNvPicPr/>
+                  </pic:nvPicPr>
+                  <pic:blipFill>
+                    <a:blip r:embed="rId14"/>
+                    <a:stretch>
+                      <a:fillRect/>
+                    </a:stretch>
+                  </pic:blipFill>
+                  <pic:spPr>
+                    <a:xfrm>
+                      <a:off x="0" y="0"/>
+                      <a:ext cx="5303520" cy="3677107"/>
+                    </a:xfrm>
+                    <a:prstGeom prst="rect"/>
+                  </pic:spPr>
+                </pic:pic>
+              </a:graphicData>
+            </a:graphic>
+          </wp:inline>
+        </w:drawing>
+      </w:r>
+    </w:p>
+    <w:tbl>
+      <w:tblPr>
+        <w:tblStyle w:val="TableGrid"/>
+        <w:tblW w:type="auto" w:w="0"/>
+        <w:tblLook w:firstColumn="1" w:firstRow="1" w:lastColumn="0" w:lastRow="0" w:noHBand="0" w:noVBand="1" w:val="04A0"/>
+      </w:tblPr>
+      <w:tblGrid>
+        <w:gridCol w:w="3137"/>
+        <w:gridCol w:w="3137"/>
+        <w:gridCol w:w="3137"/>
+      </w:tblGrid>
+      <w:tr>
+        <w:tc>
+          <w:tcPr>
+            <w:tcW w:type="dxa" w:w="3137"/>
+            <w:shd w:fill="1B365D" w:val="clear"/>
+          </w:tcPr>
+          <w:p>
+            <w:r>
+              <w:rPr>
+                <w:rFonts w:ascii="Calibri" w:hAnsi="Calibri" w:cs="Calibri"/>
+                <w:b/>
+                <w:color w:val="FFFFFF"/>
+                <w:sz w:val="16"/>
+              </w:rPr>
+              <w:t>Stage</w:t>
+            </w:r>
+          </w:p>
+        </w:tc>
+        <w:tc>
+          <w:tcPr>
+            <w:tcW w:type="dxa" w:w="3137"/>
+            <w:shd w:fill="1B365D" w:val="clear"/>
+          </w:tcPr>
+          <w:p>
+            <w:r>
+              <w:rPr>
+                <w:rFonts w:ascii="Calibri" w:hAnsi="Calibri" w:cs="Calibri"/>
+                <w:b/>
+                <w:color w:val="FFFFFF"/>
+                <w:sz w:val="16"/>
+              </w:rPr>
+              <w:t>Status</w:t>
+            </w:r>
+          </w:p>
+        </w:tc>
+        <w:tc>
+          <w:tcPr>
+            <w:tcW w:type="dxa" w:w="3137"/>
+            <w:shd w:fill="1B365D" w:val="clear"/>
+          </w:tcPr>
+          <w:p>
+            <w:r>
+              <w:rPr>
+                <w:rFonts w:ascii="Calibri" w:hAnsi="Calibri" w:cs="Calibri"/>
+                <w:b/>
+                <w:color w:val="FFFFFF"/>
+                <w:sz w:val="16"/>
+              </w:rPr>
+              <w:t>Notes</w:t>
+            </w:r>
+          </w:p>
+        </w:tc>
+      </w:tr>
+      <w:tr>
+        <w:tc>
+          <w:tcPr>
+            <w:tcW w:type="dxa" w:w="3137"/>
+          </w:tcPr>
+          <w:p>
+            <w:r>
+              <w:rPr>
+                <w:rFonts w:ascii="Calibri" w:hAnsi="Calibri" w:cs="Calibri"/>
+                <w:b w:val="0"/>
+                <w:color w:val="334155"/>
+                <w:sz w:val="16"/>
+              </w:rPr>
+              <w:t>Foundation</w:t>
+            </w:r>
+          </w:p>
+        </w:tc>
+        <w:tc>
+          <w:tcPr>
+            <w:tcW w:type="dxa" w:w="3137"/>
+          </w:tcPr>
+          <w:p>
+            <w:r>
+              <w:rPr>
+                <w:rFonts w:ascii="Calibri" w:hAnsi="Calibri" w:cs="Calibri"/>
+                <w:b w:val="0"/>
+                <w:color w:val="334155"/>
+                <w:sz w:val="16"/>
+              </w:rPr>
+              <w:t>◐ In Progress</w:t>
+            </w:r>
+          </w:p>
+        </w:tc>
+        <w:tc>
+          <w:tcPr>
+            <w:tcW w:type="dxa" w:w="3137"/>
+          </w:tcPr>
+          <w:p>
+            <w:r>
+              <w:rPr>
+                <w:rFonts w:ascii="Calibri" w:hAnsi="Calibri" w:cs="Calibri"/>
+                <w:b w:val="0"/>
+                <w:color w:val="334155"/>
+                <w:sz w:val="16"/>
+              </w:rPr>
+              <w:t>TS contracts + runtime validation assigned</w:t>
+            </w:r>
+          </w:p>
+        </w:tc>
+      </w:tr>
+      <w:tr>
+        <w:tc>
+          <w:tcPr>
+            <w:tcW w:type="dxa" w:w="3137"/>
+          </w:tcPr>
+          <w:p>
+            <w:r>
+              <w:rPr>
+                <w:rFonts w:ascii="Calibri" w:hAnsi="Calibri" w:cs="Calibri"/>
+                <w:b w:val="0"/>
+                <w:color w:val="334155"/>
+                <w:sz w:val="16"/>
+              </w:rPr>
+              <w:t>Frontend</w:t>
+            </w:r>
+          </w:p>
+        </w:tc>
+        <w:tc>
+          <w:tcPr>
+            <w:tcW w:type="dxa" w:w="3137"/>
+          </w:tcPr>
+          <w:p>
+            <w:r>
+              <w:rPr>
+                <w:rFonts w:ascii="Calibri" w:hAnsi="Calibri" w:cs="Calibri"/>
+                <w:b w:val="0"/>
+                <w:color w:val="334155"/>
+                <w:sz w:val="16"/>
+              </w:rPr>
+              <w:t>○ Not Started</w:t>
+            </w:r>
+          </w:p>
+        </w:tc>
+        <w:tc>
+          <w:tcPr>
+            <w:tcW w:type="dxa" w:w="3137"/>
+          </w:tcPr>
+          <w:p>
+            <w:r>
+              <w:rPr>
+                <w:rFonts w:ascii="Calibri" w:hAnsi="Calibri" w:cs="Calibri"/>
+                <w:b w:val="0"/>
+                <w:color w:val="334155"/>
+                <w:sz w:val="16"/>
+              </w:rPr>
+              <w:t>Next.js App Router planned Week 1 Day 5</w:t>
+            </w:r>
+          </w:p>
+        </w:tc>
+      </w:tr>
+      <w:tr>
+        <w:tc>
+          <w:tcPr>
+            <w:tcW w:type="dxa" w:w="3137"/>
+          </w:tcPr>
+          <w:p>
+            <w:r>
+              <w:rPr>
+                <w:rFonts w:ascii="Calibri" w:hAnsi="Calibri" w:cs="Calibri"/>
+                <w:b w:val="0"/>
+                <w:color w:val="334155"/>
+                <w:sz w:val="16"/>
+              </w:rPr>
+              <w:t>Backend</w:t>
+            </w:r>
+          </w:p>
+        </w:tc>
+        <w:tc>
+          <w:tcPr>
+            <w:tcW w:type="dxa" w:w="3137"/>
+          </w:tcPr>
+          <w:p>
+            <w:r>
+              <w:rPr>
+                <w:rFonts w:ascii="Calibri" w:hAnsi="Calibri" w:cs="Calibri"/>
+                <w:b w:val="0"/>
+                <w:color w:val="334155"/>
+                <w:sz w:val="16"/>
+              </w:rPr>
+              <w:t>○ Not Started</w:t>
+            </w:r>
+          </w:p>
+        </w:tc>
+        <w:tc>
+          <w:tcPr>
+            <w:tcW w:type="dxa" w:w="3137"/>
+          </w:tcPr>
+          <w:p>
+            <w:r>
+              <w:rPr>
+                <w:rFonts w:ascii="Calibri" w:hAnsi="Calibri" w:cs="Calibri"/>
+                <w:b w:val="0"/>
+                <w:color w:val="334155"/>
+                <w:sz w:val="16"/>
+              </w:rPr>
+              <w:t>Route handlers after parser exists</w:t>
+            </w:r>
+          </w:p>
+        </w:tc>
+      </w:tr>
+      <w:tr>
+        <w:tc>
+          <w:tcPr>
+            <w:tcW w:type="dxa" w:w="3137"/>
+          </w:tcPr>
+          <w:p>
+            <w:r>
+              <w:rPr>
+                <w:rFonts w:ascii="Calibri" w:hAnsi="Calibri" w:cs="Calibri"/>
+                <w:b w:val="0"/>
+                <w:color w:val="334155"/>
+                <w:sz w:val="16"/>
+              </w:rPr>
+              <w:t>Database</w:t>
+            </w:r>
+          </w:p>
+        </w:tc>
+        <w:tc>
+          <w:tcPr>
+            <w:tcW w:type="dxa" w:w="3137"/>
+          </w:tcPr>
+          <w:p>
+            <w:r>
+              <w:rPr>
+                <w:rFonts w:ascii="Calibri" w:hAnsi="Calibri" w:cs="Calibri"/>
+                <w:b w:val="0"/>
+                <w:color w:val="334155"/>
+                <w:sz w:val="16"/>
+              </w:rPr>
+              <w:t>○ Not Started</w:t>
+            </w:r>
+          </w:p>
+        </w:tc>
+        <w:tc>
+          <w:tcPr>
+            <w:tcW w:type="dxa" w:w="3137"/>
+          </w:tcPr>
+          <w:p>
+            <w:r>
+              <w:rPr>
+                <w:rFonts w:ascii="Calibri" w:hAnsi="Calibri" w:cs="Calibri"/>
+                <w:b w:val="0"/>
+                <w:color w:val="334155"/>
+                <w:sz w:val="16"/>
+              </w:rPr>
+              <w:t>PostgreSQL after in-memory model</w:t>
+            </w:r>
+          </w:p>
+        </w:tc>
+      </w:tr>
+      <w:tr>
+        <w:tc>
+          <w:tcPr>
+            <w:tcW w:type="dxa" w:w="3137"/>
+          </w:tcPr>
+          <w:p>
+            <w:r>
+              <w:rPr>
+                <w:rFonts w:ascii="Calibri" w:hAnsi="Calibri" w:cs="Calibri"/>
+                <w:b w:val="0"/>
+                <w:color w:val="334155"/>
+                <w:sz w:val="16"/>
+              </w:rPr>
+              <w:t>Security</w:t>
+            </w:r>
+          </w:p>
+        </w:tc>
+        <w:tc>
+          <w:tcPr>
+            <w:tcW w:type="dxa" w:w="3137"/>
+          </w:tcPr>
+          <w:p>
+            <w:r>
+              <w:rPr>
+                <w:rFonts w:ascii="Calibri" w:hAnsi="Calibri" w:cs="Calibri"/>
+                <w:b w:val="0"/>
+                <w:color w:val="334155"/>
+                <w:sz w:val="16"/>
+              </w:rPr>
+              <w:t>◐ Partial intro</w:t>
+            </w:r>
+          </w:p>
+        </w:tc>
+        <w:tc>
+          <w:tcPr>
+            <w:tcW w:type="dxa" w:w="3137"/>
+          </w:tcPr>
+          <w:p>
+            <w:r>
+              <w:rPr>
+                <w:rFonts w:ascii="Calibri" w:hAnsi="Calibri" w:cs="Calibri"/>
+                <w:b w:val="0"/>
+                <w:color w:val="334155"/>
+                <w:sz w:val="16"/>
+              </w:rPr>
+              <w:t>Input validation boundary started Day 2</w:t>
+            </w:r>
+          </w:p>
+        </w:tc>
+      </w:tr>
+      <w:tr>
+        <w:tc>
+          <w:tcPr>
+            <w:tcW w:type="dxa" w:w="3137"/>
+          </w:tcPr>
+          <w:p>
+            <w:r>
+              <w:rPr>
+                <w:rFonts w:ascii="Calibri" w:hAnsi="Calibri" w:cs="Calibri"/>
+                <w:b w:val="0"/>
+                <w:color w:val="334155"/>
+                <w:sz w:val="16"/>
+              </w:rPr>
+              <w:t>DevOps</w:t>
+            </w:r>
+          </w:p>
+        </w:tc>
+        <w:tc>
+          <w:tcPr>
+            <w:tcW w:type="dxa" w:w="3137"/>
+          </w:tcPr>
+          <w:p>
+            <w:r>
+              <w:rPr>
+                <w:rFonts w:ascii="Calibri" w:hAnsi="Calibri" w:cs="Calibri"/>
+                <w:b w:val="0"/>
+                <w:color w:val="334155"/>
+                <w:sz w:val="16"/>
+              </w:rPr>
+              <w:t>○ Not Started</w:t>
+            </w:r>
+          </w:p>
+        </w:tc>
+        <w:tc>
+          <w:tcPr>
+            <w:tcW w:type="dxa" w:w="3137"/>
+          </w:tcPr>
+          <w:p>
+            <w:r>
+              <w:rPr>
+                <w:rFonts w:ascii="Calibri" w:hAnsi="Calibri" w:cs="Calibri"/>
+                <w:b w:val="0"/>
+                <w:color w:val="334155"/>
+                <w:sz w:val="16"/>
+              </w:rPr>
+              <w:t>Docker later</w:t>
+            </w:r>
+          </w:p>
+        </w:tc>
+      </w:tr>
+      <w:tr>
+        <w:tc>
+          <w:tcPr>
+            <w:tcW w:type="dxa" w:w="3137"/>
+          </w:tcPr>
+          <w:p>
+            <w:r>
+              <w:rPr>
+                <w:rFonts w:ascii="Calibri" w:hAnsi="Calibri" w:cs="Calibri"/>
+                <w:b w:val="0"/>
+                <w:color w:val="334155"/>
+                <w:sz w:val="16"/>
+              </w:rPr>
+              <w:t>Cloud</w:t>
+            </w:r>
+          </w:p>
+        </w:tc>
+        <w:tc>
+          <w:tcPr>
+            <w:tcW w:type="dxa" w:w="3137"/>
+          </w:tcPr>
+          <w:p>
+            <w:r>
+              <w:rPr>
+                <w:rFonts w:ascii="Calibri" w:hAnsi="Calibri" w:cs="Calibri"/>
+                <w:b w:val="0"/>
+                <w:color w:val="334155"/>
+                <w:sz w:val="16"/>
+              </w:rPr>
+              <w:t>○ Not Started</w:t>
+            </w:r>
+          </w:p>
+        </w:tc>
+        <w:tc>
+          <w:tcPr>
+            <w:tcW w:type="dxa" w:w="3137"/>
+          </w:tcPr>
+          <w:p>
+            <w:r>
+              <w:rPr>
+                <w:rFonts w:ascii="Calibri" w:hAnsi="Calibri" w:cs="Calibri"/>
+                <w:b w:val="0"/>
+                <w:color w:val="334155"/>
+                <w:sz w:val="16"/>
+              </w:rPr>
+              <w:t>—</w:t>
+            </w:r>
+          </w:p>
+        </w:tc>
+      </w:tr>
+      <w:tr>
+        <w:tc>
+          <w:tcPr>
+            <w:tcW w:type="dxa" w:w="3137"/>
+          </w:tcPr>
+          <w:p>
+            <w:r>
+              <w:rPr>
+                <w:rFonts w:ascii="Calibri" w:hAnsi="Calibri" w:cs="Calibri"/>
+                <w:b w:val="0"/>
+                <w:color w:val="334155"/>
+                <w:sz w:val="16"/>
+              </w:rPr>
+              <w:t>System Design</w:t>
+            </w:r>
+          </w:p>
+        </w:tc>
+        <w:tc>
+          <w:tcPr>
+            <w:tcW w:type="dxa" w:w="3137"/>
+          </w:tcPr>
+          <w:p>
+            <w:r>
+              <w:rPr>
+                <w:rFonts w:ascii="Calibri" w:hAnsi="Calibri" w:cs="Calibri"/>
+                <w:b w:val="0"/>
+                <w:color w:val="334155"/>
+                <w:sz w:val="16"/>
+              </w:rPr>
+              <w:t>◐ Named</w:t>
+            </w:r>
+          </w:p>
+        </w:tc>
+        <w:tc>
+          <w:tcPr>
+            <w:tcW w:type="dxa" w:w="3137"/>
+          </w:tcPr>
+          <w:p>
+            <w:r>
+              <w:rPr>
+                <w:rFonts w:ascii="Calibri" w:hAnsi="Calibri" w:cs="Calibri"/>
+                <w:b w:val="0"/>
+                <w:color w:val="334155"/>
+                <w:sz w:val="16"/>
+              </w:rPr>
+              <w:t>Trust boundaries introduced; not practiced</w:t>
+            </w:r>
+          </w:p>
+        </w:tc>
+      </w:tr>
+      <w:tr>
+        <w:tc>
+          <w:tcPr>
+            <w:tcW w:type="dxa" w:w="3137"/>
+          </w:tcPr>
+          <w:p>
+            <w:r>
+              <w:rPr>
+                <w:rFonts w:ascii="Calibri" w:hAnsi="Calibri" w:cs="Calibri"/>
+                <w:b w:val="0"/>
+                <w:color w:val="334155"/>
+                <w:sz w:val="16"/>
+              </w:rPr>
+              <w:t>AI Engineering</w:t>
+            </w:r>
+          </w:p>
+        </w:tc>
+        <w:tc>
+          <w:tcPr>
+            <w:tcW w:type="dxa" w:w="3137"/>
+          </w:tcPr>
+          <w:p>
+            <w:r>
+              <w:rPr>
+                <w:rFonts w:ascii="Calibri" w:hAnsi="Calibri" w:cs="Calibri"/>
+                <w:b w:val="0"/>
+                <w:color w:val="334155"/>
+                <w:sz w:val="16"/>
+              </w:rPr>
+              <w:t>◐ Named</w:t>
+            </w:r>
+          </w:p>
+        </w:tc>
+        <w:tc>
+          <w:tcPr>
+            <w:tcW w:type="dxa" w:w="3137"/>
+          </w:tcPr>
+          <w:p>
+            <w:r>
+              <w:rPr>
+                <w:rFonts w:ascii="Calibri" w:hAnsi="Calibri" w:cs="Calibri"/>
+                <w:b w:val="0"/>
+                <w:color w:val="334155"/>
+                <w:sz w:val="16"/>
+              </w:rPr>
+              <w:t>When AI is wrong + structured output intro</w:t>
+            </w:r>
+          </w:p>
+        </w:tc>
+      </w:tr>
+    </w:tbl>
     <w:p>
       <w:pPr>
         <w:pStyle w:val="Heading1"/>
@@ -7006,6 +8320,298 @@
           <w:sz w:val="22"/>
         </w:rPr>
         <w:t>Structural typing is the right default for TS. Do not fight it by cloning Java class hierarchies. Do use branded/nominal patterns (e.g. IssueId vs ProjectId as distinct string brands) when mixing up IDs would be a production incident. Do not use TypeScript types as your only validation layer — that is the wrong tool for untrusted input. Runtime schemas belong at the boundary; TS types belong everywhere inside the boundary.</w:t>
+      </w:r>
+    </w:p>
+    <w:p>
+      <w:pPr>
+        <w:pStyle w:val="Heading3"/>
+      </w:pPr>
+      <w:r>
+        <w:rPr>
+          <w:rFonts w:ascii="Calibri" w:hAnsi="Calibri" w:cs="Calibri"/>
+          <w:b/>
+          <w:color w:val="0F766E"/>
+          <w:sz w:val="24"/>
+        </w:rPr>
+        <w:t>LEARNING RESOURCES  (Day 1 primary topic)</w:t>
+      </w:r>
+    </w:p>
+    <w:p>
+      <w:pPr/>
+      <w:r>
+        <w:rPr>
+          <w:rFonts w:ascii="Calibri" w:hAnsi="Calibri" w:cs="Calibri"/>
+          <w:b w:val="0"/>
+          <w:i w:val="0"/>
+          <w:color w:val="334155"/>
+          <w:sz w:val="22"/>
+        </w:rPr>
+        <w:t>Loop: READ/WATCH → UNDERSTAND → EXPLAIN WITHOUT NOTES → BUILD → TEST → REFLECT → EVIDENCE. Watching alone does not move the skill matrix.</w:t>
+      </w:r>
+    </w:p>
+    <w:p>
+      <w:pPr/>
+      <w:r>
+        <w:rPr>
+          <w:rFonts w:ascii="Calibri" w:hAnsi="Calibri" w:cs="Calibri"/>
+          <w:b/>
+          <w:i w:val="0"/>
+          <w:color w:val="1B365D"/>
+          <w:sz w:val="22"/>
+        </w:rPr>
+        <w:t>1) OFFICIAL DOCUMENTATION — Type Compatibility (structural typing)</w:t>
+      </w:r>
+    </w:p>
+    <w:p>
+      <w:pPr/>
+      <w:r>
+        <w:rPr>
+          <w:rFonts w:ascii="Calibri" w:hAnsi="Calibri" w:cs="Calibri"/>
+          <w:b w:val="0"/>
+          <w:i w:val="0"/>
+          <w:color w:val="334155"/>
+          <w:sz w:val="22"/>
+        </w:rPr>
+        <w:t>Purpose: Read the structural typing / compatibility explanation and the object-literal excess-property note. Stop when you can explain why extra fields survive on variables but fresh literals are checked.</w:t>
+      </w:r>
+    </w:p>
+    <w:p>
+      <w:pPr/>
+      <w:r>
+        <w:rPr>
+          <w:rFonts w:ascii="Calibri" w:hAnsi="Calibri" w:cs="Calibri"/>
+          <w:b w:val="0"/>
+          <w:i w:val="0"/>
+          <w:color w:val="334155"/>
+          <w:sz w:val="22"/>
+        </w:rPr>
+        <w:t xml:space="preserve">Link: </w:t>
+      </w:r>
+      <w:hyperlink r:id="rId15">
+        <w:r>
+          <w:rPr>
+            <w:color w:val="0F766E"/>
+            <w:u w:val="single"/>
+            <w:sz w:val="20"/>
+            <w:rFonts w:ascii="Calibri" w:hAnsi="Calibri"/>
+          </w:rPr>
+          <w:t xml:space="preserve">https://www.typescriptlang.org/docs/handbook/type-compatibility</w:t>
+        </w:r>
+      </w:hyperlink>
+    </w:p>
+    <w:p>
+      <w:pPr/>
+      <w:r>
+        <w:rPr>
+          <w:rFonts w:ascii="Calibri" w:hAnsi="Calibri" w:cs="Calibri"/>
+          <w:b/>
+          <w:i w:val="0"/>
+          <w:color w:val="1B365D"/>
+          <w:sz w:val="22"/>
+        </w:rPr>
+        <w:t>2) OFFICIAL DOCUMENTATION — Object Types → Excess Property Checks</w:t>
+      </w:r>
+    </w:p>
+    <w:p>
+      <w:pPr/>
+      <w:r>
+        <w:rPr>
+          <w:rFonts w:ascii="Calibri" w:hAnsi="Calibri" w:cs="Calibri"/>
+          <w:b w:val="0"/>
+          <w:i w:val="0"/>
+          <w:color w:val="334155"/>
+          <w:sz w:val="22"/>
+        </w:rPr>
+        <w:t>Purpose: Read only the Excess Property Checks section. Do not binge the entire Object Types page today.</w:t>
+      </w:r>
+    </w:p>
+    <w:p>
+      <w:pPr/>
+      <w:r>
+        <w:rPr>
+          <w:rFonts w:ascii="Calibri" w:hAnsi="Calibri" w:cs="Calibri"/>
+          <w:b w:val="0"/>
+          <w:i w:val="0"/>
+          <w:color w:val="334155"/>
+          <w:sz w:val="22"/>
+        </w:rPr>
+        <w:t xml:space="preserve">Link: </w:t>
+      </w:r>
+      <w:hyperlink r:id="rId16">
+        <w:r>
+          <w:rPr>
+            <w:color w:val="0F766E"/>
+            <w:u w:val="single"/>
+            <w:sz w:val="20"/>
+            <w:rFonts w:ascii="Calibri" w:hAnsi="Calibri"/>
+          </w:rPr>
+          <w:t xml:space="preserve">https://www.typescriptlang.org/docs/handbook/2/objects.html#excess-property-checks</w:t>
+        </w:r>
+      </w:hyperlink>
+    </w:p>
+    <w:p>
+      <w:pPr/>
+      <w:r>
+        <w:rPr>
+          <w:rFonts w:ascii="Calibri" w:hAnsi="Calibri" w:cs="Calibri"/>
+          <w:b/>
+          <w:i w:val="0"/>
+          <w:color w:val="1B365D"/>
+          <w:sz w:val="22"/>
+        </w:rPr>
+        <w:t>3) HANDS-ON — TypeScript Playground: Structural Typing example</w:t>
+      </w:r>
+    </w:p>
+    <w:p>
+      <w:pPr/>
+      <w:r>
+        <w:rPr>
+          <w:rFonts w:ascii="Calibri" w:hAnsi="Calibri" w:cs="Calibri"/>
+          <w:b w:val="0"/>
+          <w:i w:val="0"/>
+          <w:color w:val="334155"/>
+          <w:sz w:val="22"/>
+        </w:rPr>
+        <w:t>Purpose: Open, run, then edit: add an extra field and observe when the compiler complains vs when it does not. Max 15 minutes.</w:t>
+      </w:r>
+    </w:p>
+    <w:p>
+      <w:pPr/>
+      <w:r>
+        <w:rPr>
+          <w:rFonts w:ascii="Calibri" w:hAnsi="Calibri" w:cs="Calibri"/>
+          <w:b w:val="0"/>
+          <w:i w:val="0"/>
+          <w:color w:val="334155"/>
+          <w:sz w:val="22"/>
+        </w:rPr>
+        <w:t xml:space="preserve">Link: </w:t>
+      </w:r>
+      <w:hyperlink r:id="rId17">
+        <w:r>
+          <w:rPr>
+            <w:color w:val="0F766E"/>
+            <w:u w:val="single"/>
+            <w:sz w:val="20"/>
+            <w:rFonts w:ascii="Calibri" w:hAnsi="Calibri"/>
+          </w:rPr>
+          <w:t xml:space="preserve">https://www.typescriptlang.org/play/typescript/language/structural-typing.ts.html</w:t>
+        </w:r>
+      </w:hyperlink>
+    </w:p>
+    <w:p>
+      <w:pPr/>
+      <w:r>
+        <w:rPr>
+          <w:rFonts w:ascii="Calibri" w:hAnsi="Calibri" w:cs="Calibri"/>
+          <w:b/>
+          <w:i w:val="0"/>
+          <w:color w:val="1B365D"/>
+          <w:sz w:val="22"/>
+        </w:rPr>
+        <w:t>4) YOUTUBE — Coding Shorts: Structural Typing in TypeScript</w:t>
+      </w:r>
+    </w:p>
+    <w:p>
+      <w:pPr/>
+      <w:r>
+        <w:rPr>
+          <w:rFonts w:ascii="Calibri" w:hAnsi="Calibri" w:cs="Calibri"/>
+          <w:b w:val="0"/>
+          <w:i w:val="0"/>
+          <w:color w:val="334155"/>
+          <w:sz w:val="22"/>
+        </w:rPr>
+        <w:t>Title: Coding Shorts: Structural Typing in TypeScript</w:t>
+      </w:r>
+    </w:p>
+    <w:p>
+      <w:pPr/>
+      <w:r>
+        <w:rPr>
+          <w:rFonts w:ascii="Calibri" w:hAnsi="Calibri" w:cs="Calibri"/>
+          <w:b w:val="0"/>
+          <w:i w:val="0"/>
+          <w:color w:val="334155"/>
+          <w:sz w:val="22"/>
+        </w:rPr>
+        <w:t>Channel: Shawn Wildermuth</w:t>
+      </w:r>
+    </w:p>
+    <w:p>
+      <w:pPr/>
+      <w:r>
+        <w:rPr>
+          <w:rFonts w:ascii="Calibri" w:hAnsi="Calibri" w:cs="Calibri"/>
+          <w:b w:val="0"/>
+          <w:i w:val="0"/>
+          <w:color w:val="334155"/>
+          <w:sz w:val="22"/>
+        </w:rPr>
+        <w:t>Approximate duration: Confirm in the YouTube player before watching. Coding Shorts are usually brief; if this exceeds ~15 minutes, stop and return to official docs + playground.</w:t>
+      </w:r>
+    </w:p>
+    <w:p>
+      <w:pPr/>
+      <w:r>
+        <w:rPr>
+          <w:rFonts w:ascii="Calibri" w:hAnsi="Calibri" w:cs="Calibri"/>
+          <w:b w:val="0"/>
+          <w:i w:val="0"/>
+          <w:color w:val="334155"/>
+          <w:sz w:val="22"/>
+        </w:rPr>
+        <w:t>Why useful: Fast mental model for shape-based typing vs nominal typing — matches Day 1’s exact objective.</w:t>
+      </w:r>
+    </w:p>
+    <w:p>
+      <w:pPr/>
+      <w:r>
+        <w:rPr>
+          <w:rFonts w:ascii="Calibri" w:hAnsi="Calibri" w:cs="Calibri"/>
+          <w:b w:val="0"/>
+          <w:i w:val="0"/>
+          <w:color w:val="334155"/>
+          <w:sz w:val="22"/>
+        </w:rPr>
+        <w:t xml:space="preserve">Link: </w:t>
+      </w:r>
+      <w:hyperlink r:id="rId18">
+        <w:r>
+          <w:rPr>
+            <w:color w:val="0F766E"/>
+            <w:u w:val="single"/>
+            <w:sz w:val="20"/>
+            <w:rFonts w:ascii="Calibri" w:hAnsi="Calibri"/>
+          </w:rPr>
+          <w:t xml:space="preserve">https://www.youtube.com/watch?v=zfQgsGXTpOg</w:t>
+        </w:r>
+      </w:hyperlink>
+    </w:p>
+    <w:p>
+      <w:pPr/>
+      <w:r>
+        <w:rPr>
+          <w:rFonts w:ascii="Calibri" w:hAnsi="Calibri" w:cs="Calibri"/>
+          <w:b/>
+          <w:i w:val="0"/>
+          <w:color w:val="1B365D"/>
+          <w:sz w:val="22"/>
+        </w:rPr>
+        <w:t>5) PRACTICE — Day 1 ForgeBoard build task (this journal)</w:t>
+      </w:r>
+    </w:p>
+    <w:p>
+      <w:pPr/>
+      <w:r>
+        <w:rPr>
+          <w:rFonts w:ascii="Calibri" w:hAnsi="Calibri" w:cs="Calibri"/>
+          <w:b w:val="0"/>
+          <w:i w:val="0"/>
+          <w:color w:val="334155"/>
+          <w:sz w:val="22"/>
+        </w:rPr>
+        <w:t>Purpose: Implement parseCreateIssue + tests. This is the evidence path. Prefer this over more videos.</w:t>
       </w:r>
     </w:p>
     <w:p>
@@ -8810,6 +10416,346 @@
           <w:color w:val="0F766E"/>
           <w:sz w:val="24"/>
         </w:rPr>
+        <w:t>LEARNING RESOURCES  (Day 2 primary topic)</w:t>
+      </w:r>
+    </w:p>
+    <w:p>
+      <w:pPr/>
+      <w:r>
+        <w:rPr>
+          <w:rFonts w:ascii="Calibri" w:hAnsi="Calibri" w:cs="Calibri"/>
+          <w:b w:val="0"/>
+          <w:i w:val="0"/>
+          <w:color w:val="334155"/>
+          <w:sz w:val="22"/>
+        </w:rPr>
+        <w:t>Primary objective today: unknown + type guards + ParseResult at the trust boundary. Do not start a Zod rabbit hole unless the hand-rolled parser already works.</w:t>
+      </w:r>
+    </w:p>
+    <w:p>
+      <w:pPr/>
+      <w:r>
+        <w:rPr>
+          <w:rFonts w:ascii="Calibri" w:hAnsi="Calibri" w:cs="Calibri"/>
+          <w:b/>
+          <w:i w:val="0"/>
+          <w:color w:val="1B365D"/>
+          <w:sz w:val="22"/>
+        </w:rPr>
+        <w:t>1) OFFICIAL DOCUMENTATION — Narrowing (type guards &amp; type predicates)</w:t>
+      </w:r>
+    </w:p>
+    <w:p>
+      <w:pPr/>
+      <w:r>
+        <w:rPr>
+          <w:rFonts w:ascii="Calibri" w:hAnsi="Calibri" w:cs="Calibri"/>
+          <w:b w:val="0"/>
+          <w:i w:val="0"/>
+          <w:color w:val="334155"/>
+          <w:sz w:val="22"/>
+        </w:rPr>
+        <w:t>Purpose: Read sections on typeof quirks (null), using type predicates, and control-flow narrowing. Skip assertion functions until you need them.</w:t>
+      </w:r>
+    </w:p>
+    <w:p>
+      <w:pPr/>
+      <w:r>
+        <w:rPr>
+          <w:rFonts w:ascii="Calibri" w:hAnsi="Calibri" w:cs="Calibri"/>
+          <w:b w:val="0"/>
+          <w:i w:val="0"/>
+          <w:color w:val="334155"/>
+          <w:sz w:val="22"/>
+        </w:rPr>
+        <w:t xml:space="preserve">Link: </w:t>
+      </w:r>
+      <w:hyperlink r:id="rId19">
+        <w:r>
+          <w:rPr>
+            <w:color w:val="0F766E"/>
+            <w:u w:val="single"/>
+            <w:sz w:val="20"/>
+            <w:rFonts w:ascii="Calibri" w:hAnsi="Calibri"/>
+          </w:rPr>
+          <w:t xml:space="preserve">https://www.typescriptlang.org/docs/handbook/2/narrowing.html</w:t>
+        </w:r>
+      </w:hyperlink>
+    </w:p>
+    <w:p>
+      <w:pPr/>
+      <w:r>
+        <w:rPr>
+          <w:rFonts w:ascii="Calibri" w:hAnsi="Calibri" w:cs="Calibri"/>
+          <w:b/>
+          <w:i w:val="0"/>
+          <w:color w:val="1B365D"/>
+          <w:sz w:val="22"/>
+        </w:rPr>
+        <w:t>2) YOUTUBE — Type predicates as runtime-aware guards</w:t>
+      </w:r>
+    </w:p>
+    <w:p>
+      <w:pPr/>
+      <w:r>
+        <w:rPr>
+          <w:rFonts w:ascii="Calibri" w:hAnsi="Calibri" w:cs="Calibri"/>
+          <w:b w:val="0"/>
+          <w:i w:val="0"/>
+          <w:color w:val="334155"/>
+          <w:sz w:val="22"/>
+        </w:rPr>
+        <w:t>Title: Solving assertions in TypeScript with Predicates: the runtime-aware Type Guard</w:t>
+      </w:r>
+    </w:p>
+    <w:p>
+      <w:pPr/>
+      <w:r>
+        <w:rPr>
+          <w:rFonts w:ascii="Calibri" w:hAnsi="Calibri" w:cs="Calibri"/>
+          <w:b w:val="0"/>
+          <w:i w:val="0"/>
+          <w:color w:val="334155"/>
+          <w:sz w:val="22"/>
+        </w:rPr>
+        <w:t>Channel: Atila</w:t>
+      </w:r>
+    </w:p>
+    <w:p>
+      <w:pPr/>
+      <w:r>
+        <w:rPr>
+          <w:rFonts w:ascii="Calibri" w:hAnsi="Calibri" w:cs="Calibri"/>
+          <w:b w:val="0"/>
+          <w:i w:val="0"/>
+          <w:color w:val="334155"/>
+          <w:sz w:val="22"/>
+        </w:rPr>
+        <w:t>Approximate duration: ~5–6 minutes (verified lengthSeconds ≈ 334 in this environment)</w:t>
+      </w:r>
+    </w:p>
+    <w:p>
+      <w:pPr/>
+      <w:r>
+        <w:rPr>
+          <w:rFonts w:ascii="Calibri" w:hAnsi="Calibri" w:cs="Calibri"/>
+          <w:b w:val="0"/>
+          <w:i w:val="0"/>
+          <w:color w:val="334155"/>
+          <w:sz w:val="22"/>
+        </w:rPr>
+        <w:t>Why useful: Shows why `as` is unsafe and how a type predicate ties a runtime check to a compile-time narrow — exactly Day 2.</w:t>
+      </w:r>
+    </w:p>
+    <w:p>
+      <w:pPr/>
+      <w:r>
+        <w:rPr>
+          <w:rFonts w:ascii="Calibri" w:hAnsi="Calibri" w:cs="Calibri"/>
+          <w:b w:val="0"/>
+          <w:i w:val="0"/>
+          <w:color w:val="334155"/>
+          <w:sz w:val="22"/>
+        </w:rPr>
+        <w:t xml:space="preserve">Link: </w:t>
+      </w:r>
+      <w:hyperlink r:id="rId20">
+        <w:r>
+          <w:rPr>
+            <w:color w:val="0F766E"/>
+            <w:u w:val="single"/>
+            <w:sz w:val="20"/>
+            <w:rFonts w:ascii="Calibri" w:hAnsi="Calibri"/>
+          </w:rPr>
+          <w:t xml:space="preserve">https://www.youtube.com/watch?v=s78yZGA14GE</w:t>
+        </w:r>
+      </w:hyperlink>
+    </w:p>
+    <w:p>
+      <w:pPr/>
+      <w:r>
+        <w:rPr>
+          <w:rFonts w:ascii="Calibri" w:hAnsi="Calibri" w:cs="Calibri"/>
+          <w:b/>
+          <w:i w:val="0"/>
+          <w:color w:val="1B365D"/>
+          <w:sz w:val="22"/>
+        </w:rPr>
+        <w:t>3) REFERENCE / DEEP DIVE — Type narrowing against unknown (manual validation)</w:t>
+      </w:r>
+    </w:p>
+    <w:p>
+      <w:pPr/>
+      <w:r>
+        <w:rPr>
+          <w:rFonts w:ascii="Calibri" w:hAnsi="Calibri" w:cs="Calibri"/>
+          <w:b w:val="0"/>
+          <w:i w:val="0"/>
+          <w:color w:val="334155"/>
+          <w:sz w:val="22"/>
+        </w:rPr>
+        <w:t>Purpose: Read the unknown / manual validation portion for patterns. Zod section is optional preview only — do not install Zod for today’s task. Label: current conceptual article; verify any library API versions before copying.</w:t>
+      </w:r>
+    </w:p>
+    <w:p>
+      <w:pPr/>
+      <w:r>
+        <w:rPr>
+          <w:rFonts w:ascii="Calibri" w:hAnsi="Calibri" w:cs="Calibri"/>
+          <w:b w:val="0"/>
+          <w:i w:val="0"/>
+          <w:color w:val="334155"/>
+          <w:sz w:val="22"/>
+        </w:rPr>
+        <w:t xml:space="preserve">Link: </w:t>
+      </w:r>
+      <w:hyperlink r:id="rId21">
+        <w:r>
+          <w:rPr>
+            <w:color w:val="0F766E"/>
+            <w:u w:val="single"/>
+            <w:sz w:val="20"/>
+            <w:rFonts w:ascii="Calibri" w:hAnsi="Calibri"/>
+          </w:rPr>
+          <w:t xml:space="preserve">https://www.rainerhahnekamp.com/en/type-safe-typescript-with-type-narrowing/</w:t>
+        </w:r>
+      </w:hyperlink>
+    </w:p>
+    <w:p>
+      <w:pPr/>
+      <w:r>
+        <w:rPr>
+          <w:rFonts w:ascii="Calibri" w:hAnsi="Calibri" w:cs="Calibri"/>
+          <w:b/>
+          <w:i w:val="0"/>
+          <w:color w:val="1B365D"/>
+          <w:sz w:val="22"/>
+        </w:rPr>
+        <w:t>4) AI SIDE-RESOURCE (Day 2 AI concept) — OpenAI Structured Outputs guide</w:t>
+      </w:r>
+    </w:p>
+    <w:p>
+      <w:pPr/>
+      <w:r>
+        <w:rPr>
+          <w:rFonts w:ascii="Calibri" w:hAnsi="Calibri" w:cs="Calibri"/>
+          <w:b w:val="0"/>
+          <w:i w:val="0"/>
+          <w:color w:val="334155"/>
+          <w:sz w:val="22"/>
+        </w:rPr>
+        <w:t>Purpose: Skim why schema-constrained model output still needs app-side validation. Do not build an LLM feature today.</w:t>
+      </w:r>
+    </w:p>
+    <w:p>
+      <w:pPr/>
+      <w:r>
+        <w:rPr>
+          <w:rFonts w:ascii="Calibri" w:hAnsi="Calibri" w:cs="Calibri"/>
+          <w:b w:val="0"/>
+          <w:i w:val="0"/>
+          <w:color w:val="334155"/>
+          <w:sz w:val="22"/>
+        </w:rPr>
+        <w:t xml:space="preserve">Link: </w:t>
+      </w:r>
+      <w:hyperlink r:id="rId22">
+        <w:r>
+          <w:rPr>
+            <w:color w:val="0F766E"/>
+            <w:u w:val="single"/>
+            <w:sz w:val="20"/>
+            <w:rFonts w:ascii="Calibri" w:hAnsi="Calibri"/>
+          </w:rPr>
+          <w:t xml:space="preserve">https://platform.openai.com/docs/guides/structured-outputs</w:t>
+        </w:r>
+      </w:hyperlink>
+    </w:p>
+    <w:p>
+      <w:pPr/>
+      <w:r>
+        <w:rPr>
+          <w:rFonts w:ascii="Calibri" w:hAnsi="Calibri" w:cs="Calibri"/>
+          <w:b/>
+          <w:i w:val="0"/>
+          <w:color w:val="1B365D"/>
+          <w:sz w:val="22"/>
+        </w:rPr>
+        <w:t>5) PRACTICE — Day 2 ForgeBoard parser v2 + LeetCode problems already assigned</w:t>
+      </w:r>
+    </w:p>
+    <w:p>
+      <w:pPr/>
+      <w:r>
+        <w:rPr>
+          <w:rFonts w:ascii="Calibri" w:hAnsi="Calibri" w:cs="Calibri"/>
+          <w:b w:val="0"/>
+          <w:i w:val="0"/>
+          <w:color w:val="334155"/>
+          <w:sz w:val="22"/>
+        </w:rPr>
+        <w:t>Purpose: Implement ParseResult + guards. DSA practice links (solve yourself; no editorial first):</w:t>
+      </w:r>
+    </w:p>
+    <w:p>
+      <w:pPr/>
+      <w:r>
+        <w:rPr>
+          <w:rFonts w:ascii="Calibri" w:hAnsi="Calibri" w:cs="Calibri"/>
+          <w:b w:val="0"/>
+          <w:i w:val="0"/>
+          <w:color w:val="334155"/>
+          <w:sz w:val="22"/>
+        </w:rPr>
+        <w:t xml:space="preserve">LC 560: </w:t>
+      </w:r>
+      <w:hyperlink r:id="rId23">
+        <w:r>
+          <w:rPr>
+            <w:color w:val="0F766E"/>
+            <w:u w:val="single"/>
+            <w:sz w:val="20"/>
+            <w:rFonts w:ascii="Calibri" w:hAnsi="Calibri"/>
+          </w:rPr>
+          <w:t xml:space="preserve">https://leetcode.com/problems/subarray-sum-equals-k/</w:t>
+        </w:r>
+      </w:hyperlink>
+    </w:p>
+    <w:p>
+      <w:pPr/>
+      <w:r>
+        <w:rPr>
+          <w:rFonts w:ascii="Calibri" w:hAnsi="Calibri" w:cs="Calibri"/>
+          <w:b w:val="0"/>
+          <w:i w:val="0"/>
+          <w:color w:val="334155"/>
+          <w:sz w:val="22"/>
+        </w:rPr>
+        <w:t xml:space="preserve">LC 739: </w:t>
+      </w:r>
+      <w:hyperlink r:id="rId24">
+        <w:r>
+          <w:rPr>
+            <w:color w:val="0F766E"/>
+            <w:u w:val="single"/>
+            <w:sz w:val="20"/>
+            <w:rFonts w:ascii="Calibri" w:hAnsi="Calibri"/>
+          </w:rPr>
+          <w:t xml:space="preserve">https://leetcode.com/problems/daily-temperatures/</w:t>
+        </w:r>
+      </w:hyperlink>
+    </w:p>
+    <w:p>
+      <w:pPr>
+        <w:pStyle w:val="Heading3"/>
+      </w:pPr>
+      <w:r>
+        <w:rPr>
+          <w:rFonts w:ascii="Calibri" w:hAnsi="Calibri" w:cs="Calibri"/>
+          <w:b/>
+          <w:color w:val="0F766E"/>
+          <w:sz w:val="24"/>
+        </w:rPr>
         <w:t>CODE EXAMPLE  (concept only — not parseCreateIssue)</w:t>
       </w:r>
     </w:p>
@@ -10258,11 +12204,10 @@
         <w:rPr>
           <w:rFonts w:ascii="Calibri" w:hAnsi="Calibri" w:cs="Calibri"/>
           <w:b w:val="0"/>
-          <w:i w:val="0"/>
           <w:color w:val="334155"/>
           <w:sz w:val="22"/>
         </w:rPr>
-        <w:t>STATUS:  Assigned 10 Sep 2026 (second automation run same calendar day as Day 1). Completion recorded only when success criteria are evidenced.</w:t>
+        <w:t>STATUS:  Assigned 10 Sep 2026 (second automation run same calendar day as Day 1). Same-day continuation: Learning Resources + dashboard added; still awaiting implementation evidence. Completion recorded only when success criteria are evidenced.</w:t>
       </w:r>
     </w:p>
     <w:p>
@@ -21142,6 +23087,1495 @@
     <w:p>
       <w:pPr>
         <w:pStyle w:val="Heading1"/>
+      </w:pPr>
+      <w:r>
+        <w:rPr>
+          <w:rFonts w:ascii="Calibri" w:hAnsi="Calibri" w:cs="Calibri"/>
+          <w:b/>
+          <w:color w:val="1B365D"/>
+          <w:sz w:val="32"/>
+        </w:rPr>
+        <w:t>Section 11 — Learning Resources Log</w:t>
+      </w:r>
+    </w:p>
+    <w:p>
+      <w:pPr/>
+      <w:r>
+        <w:rPr>
+          <w:rFonts w:ascii="Calibri" w:hAnsi="Calibri" w:cs="Calibri"/>
+          <w:b w:val="0"/>
+          <w:i w:val="0"/>
+          <w:color w:val="334155"/>
+          <w:sz w:val="22"/>
+        </w:rPr>
+        <w:t>Track resources assigned for topics. Do not duplicate the same URL on later days unless a new purpose appears. Used?/Useful? stay blank until the learner records them.</w:t>
+      </w:r>
+    </w:p>
+    <w:tbl>
+      <w:tblPr>
+        <w:tblStyle w:val="TableGrid"/>
+        <w:tblW w:type="auto" w:w="0"/>
+        <w:tblLook w:firstColumn="1" w:firstRow="1" w:lastColumn="0" w:lastRow="0" w:noHBand="0" w:noVBand="1" w:val="04A0"/>
+      </w:tblPr>
+      <w:tblGrid>
+        <w:gridCol w:w="1176"/>
+        <w:gridCol w:w="1176"/>
+        <w:gridCol w:w="1176"/>
+        <w:gridCol w:w="1176"/>
+        <w:gridCol w:w="1176"/>
+        <w:gridCol w:w="1176"/>
+        <w:gridCol w:w="1176"/>
+        <w:gridCol w:w="1176"/>
+      </w:tblGrid>
+      <w:tr>
+        <w:tc>
+          <w:tcPr>
+            <w:tcW w:type="dxa" w:w="1176"/>
+            <w:shd w:fill="1B365D" w:val="clear"/>
+          </w:tcPr>
+          <w:p>
+            <w:r>
+              <w:rPr>
+                <w:rFonts w:ascii="Calibri" w:hAnsi="Calibri" w:cs="Calibri"/>
+                <w:b/>
+                <w:color w:val="FFFFFF"/>
+                <w:sz w:val="16"/>
+              </w:rPr>
+              <w:t>Resource</w:t>
+            </w:r>
+          </w:p>
+        </w:tc>
+        <w:tc>
+          <w:tcPr>
+            <w:tcW w:type="dxa" w:w="1176"/>
+            <w:shd w:fill="1B365D" w:val="clear"/>
+          </w:tcPr>
+          <w:p>
+            <w:r>
+              <w:rPr>
+                <w:rFonts w:ascii="Calibri" w:hAnsi="Calibri" w:cs="Calibri"/>
+                <w:b/>
+                <w:color w:val="FFFFFF"/>
+                <w:sz w:val="16"/>
+              </w:rPr>
+              <w:t>Type</w:t>
+            </w:r>
+          </w:p>
+        </w:tc>
+        <w:tc>
+          <w:tcPr>
+            <w:tcW w:type="dxa" w:w="1176"/>
+            <w:shd w:fill="1B365D" w:val="clear"/>
+          </w:tcPr>
+          <w:p>
+            <w:r>
+              <w:rPr>
+                <w:rFonts w:ascii="Calibri" w:hAnsi="Calibri" w:cs="Calibri"/>
+                <w:b/>
+                <w:color w:val="FFFFFF"/>
+                <w:sz w:val="16"/>
+              </w:rPr>
+              <w:t>Topic</w:t>
+            </w:r>
+          </w:p>
+        </w:tc>
+        <w:tc>
+          <w:tcPr>
+            <w:tcW w:type="dxa" w:w="1176"/>
+            <w:shd w:fill="1B365D" w:val="clear"/>
+          </w:tcPr>
+          <w:p>
+            <w:r>
+              <w:rPr>
+                <w:rFonts w:ascii="Calibri" w:hAnsi="Calibri" w:cs="Calibri"/>
+                <w:b/>
+                <w:color w:val="FFFFFF"/>
+                <w:sz w:val="16"/>
+              </w:rPr>
+              <w:t>URL</w:t>
+            </w:r>
+          </w:p>
+        </w:tc>
+        <w:tc>
+          <w:tcPr>
+            <w:tcW w:type="dxa" w:w="1176"/>
+            <w:shd w:fill="1B365D" w:val="clear"/>
+          </w:tcPr>
+          <w:p>
+            <w:r>
+              <w:rPr>
+                <w:rFonts w:ascii="Calibri" w:hAnsi="Calibri" w:cs="Calibri"/>
+                <w:b/>
+                <w:color w:val="FFFFFF"/>
+                <w:sz w:val="16"/>
+              </w:rPr>
+              <w:t>Used?</w:t>
+            </w:r>
+          </w:p>
+        </w:tc>
+        <w:tc>
+          <w:tcPr>
+            <w:tcW w:type="dxa" w:w="1176"/>
+            <w:shd w:fill="1B365D" w:val="clear"/>
+          </w:tcPr>
+          <w:p>
+            <w:r>
+              <w:rPr>
+                <w:rFonts w:ascii="Calibri" w:hAnsi="Calibri" w:cs="Calibri"/>
+                <w:b/>
+                <w:color w:val="FFFFFF"/>
+                <w:sz w:val="16"/>
+              </w:rPr>
+              <w:t>Useful?</w:t>
+            </w:r>
+          </w:p>
+        </w:tc>
+        <w:tc>
+          <w:tcPr>
+            <w:tcW w:type="dxa" w:w="1176"/>
+            <w:shd w:fill="1B365D" w:val="clear"/>
+          </w:tcPr>
+          <w:p>
+            <w:r>
+              <w:rPr>
+                <w:rFonts w:ascii="Calibri" w:hAnsi="Calibri" w:cs="Calibri"/>
+                <w:b/>
+                <w:color w:val="FFFFFF"/>
+                <w:sz w:val="16"/>
+              </w:rPr>
+              <w:t>Date Used</w:t>
+            </w:r>
+          </w:p>
+        </w:tc>
+        <w:tc>
+          <w:tcPr>
+            <w:tcW w:type="dxa" w:w="1176"/>
+            <w:shd w:fill="1B365D" w:val="clear"/>
+          </w:tcPr>
+          <w:p>
+            <w:r>
+              <w:rPr>
+                <w:rFonts w:ascii="Calibri" w:hAnsi="Calibri" w:cs="Calibri"/>
+                <w:b/>
+                <w:color w:val="FFFFFF"/>
+                <w:sz w:val="16"/>
+              </w:rPr>
+              <w:t>Notes</w:t>
+            </w:r>
+          </w:p>
+        </w:tc>
+      </w:tr>
+      <w:tr>
+        <w:tc>
+          <w:tcPr>
+            <w:tcW w:type="dxa" w:w="1176"/>
+          </w:tcPr>
+          <w:p>
+            <w:r>
+              <w:rPr>
+                <w:rFonts w:ascii="Calibri" w:hAnsi="Calibri" w:cs="Calibri"/>
+                <w:b w:val="0"/>
+                <w:color w:val="334155"/>
+                <w:sz w:val="16"/>
+              </w:rPr>
+              <w:t>TS Handbook — Type Compatibility</w:t>
+            </w:r>
+          </w:p>
+        </w:tc>
+        <w:tc>
+          <w:tcPr>
+            <w:tcW w:type="dxa" w:w="1176"/>
+          </w:tcPr>
+          <w:p>
+            <w:r>
+              <w:rPr>
+                <w:rFonts w:ascii="Calibri" w:hAnsi="Calibri" w:cs="Calibri"/>
+                <w:b w:val="0"/>
+                <w:color w:val="334155"/>
+                <w:sz w:val="16"/>
+              </w:rPr>
+              <w:t>Official Docs</w:t>
+            </w:r>
+          </w:p>
+        </w:tc>
+        <w:tc>
+          <w:tcPr>
+            <w:tcW w:type="dxa" w:w="1176"/>
+          </w:tcPr>
+          <w:p>
+            <w:r>
+              <w:rPr>
+                <w:rFonts w:ascii="Calibri" w:hAnsi="Calibri" w:cs="Calibri"/>
+                <w:b w:val="0"/>
+                <w:color w:val="334155"/>
+                <w:sz w:val="16"/>
+              </w:rPr>
+              <w:t>Day 1 Structural typing</w:t>
+            </w:r>
+          </w:p>
+        </w:tc>
+        <w:tc>
+          <w:tcPr>
+            <w:tcW w:type="dxa" w:w="1176"/>
+          </w:tcPr>
+          <w:p>
+            <w:r>
+              <w:rPr>
+                <w:rFonts w:ascii="Calibri" w:hAnsi="Calibri" w:cs="Calibri"/>
+                <w:b w:val="0"/>
+                <w:color w:val="334155"/>
+                <w:sz w:val="16"/>
+              </w:rPr>
+              <w:t>https://www.typescriptlang.org/docs/handbook/type-compatibility</w:t>
+            </w:r>
+          </w:p>
+        </w:tc>
+        <w:tc>
+          <w:tcPr>
+            <w:tcW w:type="dxa" w:w="1176"/>
+          </w:tcPr>
+          <w:p>
+            <w:r>
+              <w:rPr>
+                <w:rFonts w:ascii="Calibri" w:hAnsi="Calibri" w:cs="Calibri"/>
+                <w:b w:val="0"/>
+                <w:color w:val="334155"/>
+                <w:sz w:val="16"/>
+              </w:rPr>
+              <w:t>No</w:t>
+            </w:r>
+          </w:p>
+        </w:tc>
+        <w:tc>
+          <w:tcPr>
+            <w:tcW w:type="dxa" w:w="1176"/>
+          </w:tcPr>
+          <w:p>
+            <w:r>
+              <w:rPr>
+                <w:rFonts w:ascii="Calibri" w:hAnsi="Calibri" w:cs="Calibri"/>
+                <w:b w:val="0"/>
+                <w:color w:val="334155"/>
+                <w:sz w:val="16"/>
+              </w:rPr>
+            </w:r>
+          </w:p>
+        </w:tc>
+        <w:tc>
+          <w:tcPr>
+            <w:tcW w:type="dxa" w:w="1176"/>
+          </w:tcPr>
+          <w:p>
+            <w:r>
+              <w:rPr>
+                <w:rFonts w:ascii="Calibri" w:hAnsi="Calibri" w:cs="Calibri"/>
+                <w:b w:val="0"/>
+                <w:color w:val="334155"/>
+                <w:sz w:val="16"/>
+              </w:rPr>
+            </w:r>
+          </w:p>
+        </w:tc>
+        <w:tc>
+          <w:tcPr>
+            <w:tcW w:type="dxa" w:w="1176"/>
+          </w:tcPr>
+          <w:p>
+            <w:r>
+              <w:rPr>
+                <w:rFonts w:ascii="Calibri" w:hAnsi="Calibri" w:cs="Calibri"/>
+                <w:b w:val="0"/>
+                <w:color w:val="334155"/>
+                <w:sz w:val="16"/>
+              </w:rPr>
+              <w:t>Purpose: structural typing + excess property note</w:t>
+            </w:r>
+          </w:p>
+        </w:tc>
+      </w:tr>
+      <w:tr>
+        <w:tc>
+          <w:tcPr>
+            <w:tcW w:type="dxa" w:w="1176"/>
+          </w:tcPr>
+          <w:p>
+            <w:r>
+              <w:rPr>
+                <w:rFonts w:ascii="Calibri" w:hAnsi="Calibri" w:cs="Calibri"/>
+                <w:b w:val="0"/>
+                <w:color w:val="334155"/>
+                <w:sz w:val="16"/>
+              </w:rPr>
+              <w:t>TS Handbook — Excess Property Checks</w:t>
+            </w:r>
+          </w:p>
+        </w:tc>
+        <w:tc>
+          <w:tcPr>
+            <w:tcW w:type="dxa" w:w="1176"/>
+          </w:tcPr>
+          <w:p>
+            <w:r>
+              <w:rPr>
+                <w:rFonts w:ascii="Calibri" w:hAnsi="Calibri" w:cs="Calibri"/>
+                <w:b w:val="0"/>
+                <w:color w:val="334155"/>
+                <w:sz w:val="16"/>
+              </w:rPr>
+              <w:t>Official Docs</w:t>
+            </w:r>
+          </w:p>
+        </w:tc>
+        <w:tc>
+          <w:tcPr>
+            <w:tcW w:type="dxa" w:w="1176"/>
+          </w:tcPr>
+          <w:p>
+            <w:r>
+              <w:rPr>
+                <w:rFonts w:ascii="Calibri" w:hAnsi="Calibri" w:cs="Calibri"/>
+                <w:b w:val="0"/>
+                <w:color w:val="334155"/>
+                <w:sz w:val="16"/>
+              </w:rPr>
+              <w:t>Day 1 Structural typing</w:t>
+            </w:r>
+          </w:p>
+        </w:tc>
+        <w:tc>
+          <w:tcPr>
+            <w:tcW w:type="dxa" w:w="1176"/>
+          </w:tcPr>
+          <w:p>
+            <w:r>
+              <w:rPr>
+                <w:rFonts w:ascii="Calibri" w:hAnsi="Calibri" w:cs="Calibri"/>
+                <w:b w:val="0"/>
+                <w:color w:val="334155"/>
+                <w:sz w:val="16"/>
+              </w:rPr>
+              <w:t>https://www.typescriptlang.org/docs/handbook/2/objects.html#excess-property-checks</w:t>
+            </w:r>
+          </w:p>
+        </w:tc>
+        <w:tc>
+          <w:tcPr>
+            <w:tcW w:type="dxa" w:w="1176"/>
+          </w:tcPr>
+          <w:p>
+            <w:r>
+              <w:rPr>
+                <w:rFonts w:ascii="Calibri" w:hAnsi="Calibri" w:cs="Calibri"/>
+                <w:b w:val="0"/>
+                <w:color w:val="334155"/>
+                <w:sz w:val="16"/>
+              </w:rPr>
+              <w:t>No</w:t>
+            </w:r>
+          </w:p>
+        </w:tc>
+        <w:tc>
+          <w:tcPr>
+            <w:tcW w:type="dxa" w:w="1176"/>
+          </w:tcPr>
+          <w:p>
+            <w:r>
+              <w:rPr>
+                <w:rFonts w:ascii="Calibri" w:hAnsi="Calibri" w:cs="Calibri"/>
+                <w:b w:val="0"/>
+                <w:color w:val="334155"/>
+                <w:sz w:val="16"/>
+              </w:rPr>
+            </w:r>
+          </w:p>
+        </w:tc>
+        <w:tc>
+          <w:tcPr>
+            <w:tcW w:type="dxa" w:w="1176"/>
+          </w:tcPr>
+          <w:p>
+            <w:r>
+              <w:rPr>
+                <w:rFonts w:ascii="Calibri" w:hAnsi="Calibri" w:cs="Calibri"/>
+                <w:b w:val="0"/>
+                <w:color w:val="334155"/>
+                <w:sz w:val="16"/>
+              </w:rPr>
+            </w:r>
+          </w:p>
+        </w:tc>
+        <w:tc>
+          <w:tcPr>
+            <w:tcW w:type="dxa" w:w="1176"/>
+          </w:tcPr>
+          <w:p>
+            <w:r>
+              <w:rPr>
+                <w:rFonts w:ascii="Calibri" w:hAnsi="Calibri" w:cs="Calibri"/>
+                <w:b w:val="0"/>
+                <w:color w:val="334155"/>
+                <w:sz w:val="16"/>
+              </w:rPr>
+              <w:t>Read that section only</w:t>
+            </w:r>
+          </w:p>
+        </w:tc>
+      </w:tr>
+      <w:tr>
+        <w:tc>
+          <w:tcPr>
+            <w:tcW w:type="dxa" w:w="1176"/>
+          </w:tcPr>
+          <w:p>
+            <w:r>
+              <w:rPr>
+                <w:rFonts w:ascii="Calibri" w:hAnsi="Calibri" w:cs="Calibri"/>
+                <w:b w:val="0"/>
+                <w:color w:val="334155"/>
+                <w:sz w:val="16"/>
+              </w:rPr>
+              <w:t>TS Playground — Structural Typing</w:t>
+            </w:r>
+          </w:p>
+        </w:tc>
+        <w:tc>
+          <w:tcPr>
+            <w:tcW w:type="dxa" w:w="1176"/>
+          </w:tcPr>
+          <w:p>
+            <w:r>
+              <w:rPr>
+                <w:rFonts w:ascii="Calibri" w:hAnsi="Calibri" w:cs="Calibri"/>
+                <w:b w:val="0"/>
+                <w:color w:val="334155"/>
+                <w:sz w:val="16"/>
+              </w:rPr>
+              <w:t>Hands-on</w:t>
+            </w:r>
+          </w:p>
+        </w:tc>
+        <w:tc>
+          <w:tcPr>
+            <w:tcW w:type="dxa" w:w="1176"/>
+          </w:tcPr>
+          <w:p>
+            <w:r>
+              <w:rPr>
+                <w:rFonts w:ascii="Calibri" w:hAnsi="Calibri" w:cs="Calibri"/>
+                <w:b w:val="0"/>
+                <w:color w:val="334155"/>
+                <w:sz w:val="16"/>
+              </w:rPr>
+              <w:t>Day 1 Structural typing</w:t>
+            </w:r>
+          </w:p>
+        </w:tc>
+        <w:tc>
+          <w:tcPr>
+            <w:tcW w:type="dxa" w:w="1176"/>
+          </w:tcPr>
+          <w:p>
+            <w:r>
+              <w:rPr>
+                <w:rFonts w:ascii="Calibri" w:hAnsi="Calibri" w:cs="Calibri"/>
+                <w:b w:val="0"/>
+                <w:color w:val="334155"/>
+                <w:sz w:val="16"/>
+              </w:rPr>
+              <w:t>https://www.typescriptlang.org/play/typescript/language/structural-typing.ts.html</w:t>
+            </w:r>
+          </w:p>
+        </w:tc>
+        <w:tc>
+          <w:tcPr>
+            <w:tcW w:type="dxa" w:w="1176"/>
+          </w:tcPr>
+          <w:p>
+            <w:r>
+              <w:rPr>
+                <w:rFonts w:ascii="Calibri" w:hAnsi="Calibri" w:cs="Calibri"/>
+                <w:b w:val="0"/>
+                <w:color w:val="334155"/>
+                <w:sz w:val="16"/>
+              </w:rPr>
+              <w:t>No</w:t>
+            </w:r>
+          </w:p>
+        </w:tc>
+        <w:tc>
+          <w:tcPr>
+            <w:tcW w:type="dxa" w:w="1176"/>
+          </w:tcPr>
+          <w:p>
+            <w:r>
+              <w:rPr>
+                <w:rFonts w:ascii="Calibri" w:hAnsi="Calibri" w:cs="Calibri"/>
+                <w:b w:val="0"/>
+                <w:color w:val="334155"/>
+                <w:sz w:val="16"/>
+              </w:rPr>
+            </w:r>
+          </w:p>
+        </w:tc>
+        <w:tc>
+          <w:tcPr>
+            <w:tcW w:type="dxa" w:w="1176"/>
+          </w:tcPr>
+          <w:p>
+            <w:r>
+              <w:rPr>
+                <w:rFonts w:ascii="Calibri" w:hAnsi="Calibri" w:cs="Calibri"/>
+                <w:b w:val="0"/>
+                <w:color w:val="334155"/>
+                <w:sz w:val="16"/>
+              </w:rPr>
+            </w:r>
+          </w:p>
+        </w:tc>
+        <w:tc>
+          <w:tcPr>
+            <w:tcW w:type="dxa" w:w="1176"/>
+          </w:tcPr>
+          <w:p>
+            <w:r>
+              <w:rPr>
+                <w:rFonts w:ascii="Calibri" w:hAnsi="Calibri" w:cs="Calibri"/>
+                <w:b w:val="0"/>
+                <w:color w:val="334155"/>
+                <w:sz w:val="16"/>
+              </w:rPr>
+              <w:t>Edit/run ≤15 min</w:t>
+            </w:r>
+          </w:p>
+        </w:tc>
+      </w:tr>
+      <w:tr>
+        <w:tc>
+          <w:tcPr>
+            <w:tcW w:type="dxa" w:w="1176"/>
+          </w:tcPr>
+          <w:p>
+            <w:r>
+              <w:rPr>
+                <w:rFonts w:ascii="Calibri" w:hAnsi="Calibri" w:cs="Calibri"/>
+                <w:b w:val="0"/>
+                <w:color w:val="334155"/>
+                <w:sz w:val="16"/>
+              </w:rPr>
+              <w:t>Coding Shorts: Structural Typing in TypeScript</w:t>
+            </w:r>
+          </w:p>
+        </w:tc>
+        <w:tc>
+          <w:tcPr>
+            <w:tcW w:type="dxa" w:w="1176"/>
+          </w:tcPr>
+          <w:p>
+            <w:r>
+              <w:rPr>
+                <w:rFonts w:ascii="Calibri" w:hAnsi="Calibri" w:cs="Calibri"/>
+                <w:b w:val="0"/>
+                <w:color w:val="334155"/>
+                <w:sz w:val="16"/>
+              </w:rPr>
+              <w:t>YouTube</w:t>
+            </w:r>
+          </w:p>
+        </w:tc>
+        <w:tc>
+          <w:tcPr>
+            <w:tcW w:type="dxa" w:w="1176"/>
+          </w:tcPr>
+          <w:p>
+            <w:r>
+              <w:rPr>
+                <w:rFonts w:ascii="Calibri" w:hAnsi="Calibri" w:cs="Calibri"/>
+                <w:b w:val="0"/>
+                <w:color w:val="334155"/>
+                <w:sz w:val="16"/>
+              </w:rPr>
+              <w:t>Day 1 Structural typing</w:t>
+            </w:r>
+          </w:p>
+        </w:tc>
+        <w:tc>
+          <w:tcPr>
+            <w:tcW w:type="dxa" w:w="1176"/>
+          </w:tcPr>
+          <w:p>
+            <w:r>
+              <w:rPr>
+                <w:rFonts w:ascii="Calibri" w:hAnsi="Calibri" w:cs="Calibri"/>
+                <w:b w:val="0"/>
+                <w:color w:val="334155"/>
+                <w:sz w:val="16"/>
+              </w:rPr>
+              <w:t>https://www.youtube.com/watch?v=zfQgsGXTpOg</w:t>
+            </w:r>
+          </w:p>
+        </w:tc>
+        <w:tc>
+          <w:tcPr>
+            <w:tcW w:type="dxa" w:w="1176"/>
+          </w:tcPr>
+          <w:p>
+            <w:r>
+              <w:rPr>
+                <w:rFonts w:ascii="Calibri" w:hAnsi="Calibri" w:cs="Calibri"/>
+                <w:b w:val="0"/>
+                <w:color w:val="334155"/>
+                <w:sz w:val="16"/>
+              </w:rPr>
+              <w:t>No</w:t>
+            </w:r>
+          </w:p>
+        </w:tc>
+        <w:tc>
+          <w:tcPr>
+            <w:tcW w:type="dxa" w:w="1176"/>
+          </w:tcPr>
+          <w:p>
+            <w:r>
+              <w:rPr>
+                <w:rFonts w:ascii="Calibri" w:hAnsi="Calibri" w:cs="Calibri"/>
+                <w:b w:val="0"/>
+                <w:color w:val="334155"/>
+                <w:sz w:val="16"/>
+              </w:rPr>
+            </w:r>
+          </w:p>
+        </w:tc>
+        <w:tc>
+          <w:tcPr>
+            <w:tcW w:type="dxa" w:w="1176"/>
+          </w:tcPr>
+          <w:p>
+            <w:r>
+              <w:rPr>
+                <w:rFonts w:ascii="Calibri" w:hAnsi="Calibri" w:cs="Calibri"/>
+                <w:b w:val="0"/>
+                <w:color w:val="334155"/>
+                <w:sz w:val="16"/>
+              </w:rPr>
+            </w:r>
+          </w:p>
+        </w:tc>
+        <w:tc>
+          <w:tcPr>
+            <w:tcW w:type="dxa" w:w="1176"/>
+          </w:tcPr>
+          <w:p>
+            <w:r>
+              <w:rPr>
+                <w:rFonts w:ascii="Calibri" w:hAnsi="Calibri" w:cs="Calibri"/>
+                <w:b w:val="0"/>
+                <w:color w:val="334155"/>
+                <w:sz w:val="16"/>
+              </w:rPr>
+              <w:t>Shawn Wildermuth — confirm duration in player</w:t>
+            </w:r>
+          </w:p>
+        </w:tc>
+      </w:tr>
+      <w:tr>
+        <w:tc>
+          <w:tcPr>
+            <w:tcW w:type="dxa" w:w="1176"/>
+          </w:tcPr>
+          <w:p>
+            <w:r>
+              <w:rPr>
+                <w:rFonts w:ascii="Calibri" w:hAnsi="Calibri" w:cs="Calibri"/>
+                <w:b w:val="0"/>
+                <w:color w:val="334155"/>
+                <w:sz w:val="16"/>
+              </w:rPr>
+              <w:t>TS Handbook — Narrowing</w:t>
+            </w:r>
+          </w:p>
+        </w:tc>
+        <w:tc>
+          <w:tcPr>
+            <w:tcW w:type="dxa" w:w="1176"/>
+          </w:tcPr>
+          <w:p>
+            <w:r>
+              <w:rPr>
+                <w:rFonts w:ascii="Calibri" w:hAnsi="Calibri" w:cs="Calibri"/>
+                <w:b w:val="0"/>
+                <w:color w:val="334155"/>
+                <w:sz w:val="16"/>
+              </w:rPr>
+              <w:t>Official Docs</w:t>
+            </w:r>
+          </w:p>
+        </w:tc>
+        <w:tc>
+          <w:tcPr>
+            <w:tcW w:type="dxa" w:w="1176"/>
+          </w:tcPr>
+          <w:p>
+            <w:r>
+              <w:rPr>
+                <w:rFonts w:ascii="Calibri" w:hAnsi="Calibri" w:cs="Calibri"/>
+                <w:b w:val="0"/>
+                <w:color w:val="334155"/>
+                <w:sz w:val="16"/>
+              </w:rPr>
+              <w:t>Day 2 Runtime validation</w:t>
+            </w:r>
+          </w:p>
+        </w:tc>
+        <w:tc>
+          <w:tcPr>
+            <w:tcW w:type="dxa" w:w="1176"/>
+          </w:tcPr>
+          <w:p>
+            <w:r>
+              <w:rPr>
+                <w:rFonts w:ascii="Calibri" w:hAnsi="Calibri" w:cs="Calibri"/>
+                <w:b w:val="0"/>
+                <w:color w:val="334155"/>
+                <w:sz w:val="16"/>
+              </w:rPr>
+              <w:t>https://www.typescriptlang.org/docs/handbook/2/narrowing.html</w:t>
+            </w:r>
+          </w:p>
+        </w:tc>
+        <w:tc>
+          <w:tcPr>
+            <w:tcW w:type="dxa" w:w="1176"/>
+          </w:tcPr>
+          <w:p>
+            <w:r>
+              <w:rPr>
+                <w:rFonts w:ascii="Calibri" w:hAnsi="Calibri" w:cs="Calibri"/>
+                <w:b w:val="0"/>
+                <w:color w:val="334155"/>
+                <w:sz w:val="16"/>
+              </w:rPr>
+              <w:t>No</w:t>
+            </w:r>
+          </w:p>
+        </w:tc>
+        <w:tc>
+          <w:tcPr>
+            <w:tcW w:type="dxa" w:w="1176"/>
+          </w:tcPr>
+          <w:p>
+            <w:r>
+              <w:rPr>
+                <w:rFonts w:ascii="Calibri" w:hAnsi="Calibri" w:cs="Calibri"/>
+                <w:b w:val="0"/>
+                <w:color w:val="334155"/>
+                <w:sz w:val="16"/>
+              </w:rPr>
+            </w:r>
+          </w:p>
+        </w:tc>
+        <w:tc>
+          <w:tcPr>
+            <w:tcW w:type="dxa" w:w="1176"/>
+          </w:tcPr>
+          <w:p>
+            <w:r>
+              <w:rPr>
+                <w:rFonts w:ascii="Calibri" w:hAnsi="Calibri" w:cs="Calibri"/>
+                <w:b w:val="0"/>
+                <w:color w:val="334155"/>
+                <w:sz w:val="16"/>
+              </w:rPr>
+            </w:r>
+          </w:p>
+        </w:tc>
+        <w:tc>
+          <w:tcPr>
+            <w:tcW w:type="dxa" w:w="1176"/>
+          </w:tcPr>
+          <w:p>
+            <w:r>
+              <w:rPr>
+                <w:rFonts w:ascii="Calibri" w:hAnsi="Calibri" w:cs="Calibri"/>
+                <w:b w:val="0"/>
+                <w:color w:val="334155"/>
+                <w:sz w:val="16"/>
+              </w:rPr>
+              <w:t>Type predicates + typeof null quirk</w:t>
+            </w:r>
+          </w:p>
+        </w:tc>
+      </w:tr>
+      <w:tr>
+        <w:tc>
+          <w:tcPr>
+            <w:tcW w:type="dxa" w:w="1176"/>
+          </w:tcPr>
+          <w:p>
+            <w:r>
+              <w:rPr>
+                <w:rFonts w:ascii="Calibri" w:hAnsi="Calibri" w:cs="Calibri"/>
+                <w:b w:val="0"/>
+                <w:color w:val="334155"/>
+                <w:sz w:val="16"/>
+              </w:rPr>
+              <w:t>Predicates: the runtime-aware Type Guard</w:t>
+            </w:r>
+          </w:p>
+        </w:tc>
+        <w:tc>
+          <w:tcPr>
+            <w:tcW w:type="dxa" w:w="1176"/>
+          </w:tcPr>
+          <w:p>
+            <w:r>
+              <w:rPr>
+                <w:rFonts w:ascii="Calibri" w:hAnsi="Calibri" w:cs="Calibri"/>
+                <w:b w:val="0"/>
+                <w:color w:val="334155"/>
+                <w:sz w:val="16"/>
+              </w:rPr>
+              <w:t>YouTube</w:t>
+            </w:r>
+          </w:p>
+        </w:tc>
+        <w:tc>
+          <w:tcPr>
+            <w:tcW w:type="dxa" w:w="1176"/>
+          </w:tcPr>
+          <w:p>
+            <w:r>
+              <w:rPr>
+                <w:rFonts w:ascii="Calibri" w:hAnsi="Calibri" w:cs="Calibri"/>
+                <w:b w:val="0"/>
+                <w:color w:val="334155"/>
+                <w:sz w:val="16"/>
+              </w:rPr>
+              <w:t>Day 2 Runtime validation</w:t>
+            </w:r>
+          </w:p>
+        </w:tc>
+        <w:tc>
+          <w:tcPr>
+            <w:tcW w:type="dxa" w:w="1176"/>
+          </w:tcPr>
+          <w:p>
+            <w:r>
+              <w:rPr>
+                <w:rFonts w:ascii="Calibri" w:hAnsi="Calibri" w:cs="Calibri"/>
+                <w:b w:val="0"/>
+                <w:color w:val="334155"/>
+                <w:sz w:val="16"/>
+              </w:rPr>
+              <w:t>https://www.youtube.com/watch?v=s78yZGA14GE</w:t>
+            </w:r>
+          </w:p>
+        </w:tc>
+        <w:tc>
+          <w:tcPr>
+            <w:tcW w:type="dxa" w:w="1176"/>
+          </w:tcPr>
+          <w:p>
+            <w:r>
+              <w:rPr>
+                <w:rFonts w:ascii="Calibri" w:hAnsi="Calibri" w:cs="Calibri"/>
+                <w:b w:val="0"/>
+                <w:color w:val="334155"/>
+                <w:sz w:val="16"/>
+              </w:rPr>
+              <w:t>No</w:t>
+            </w:r>
+          </w:p>
+        </w:tc>
+        <w:tc>
+          <w:tcPr>
+            <w:tcW w:type="dxa" w:w="1176"/>
+          </w:tcPr>
+          <w:p>
+            <w:r>
+              <w:rPr>
+                <w:rFonts w:ascii="Calibri" w:hAnsi="Calibri" w:cs="Calibri"/>
+                <w:b w:val="0"/>
+                <w:color w:val="334155"/>
+                <w:sz w:val="16"/>
+              </w:rPr>
+            </w:r>
+          </w:p>
+        </w:tc>
+        <w:tc>
+          <w:tcPr>
+            <w:tcW w:type="dxa" w:w="1176"/>
+          </w:tcPr>
+          <w:p>
+            <w:r>
+              <w:rPr>
+                <w:rFonts w:ascii="Calibri" w:hAnsi="Calibri" w:cs="Calibri"/>
+                <w:b w:val="0"/>
+                <w:color w:val="334155"/>
+                <w:sz w:val="16"/>
+              </w:rPr>
+            </w:r>
+          </w:p>
+        </w:tc>
+        <w:tc>
+          <w:tcPr>
+            <w:tcW w:type="dxa" w:w="1176"/>
+          </w:tcPr>
+          <w:p>
+            <w:r>
+              <w:rPr>
+                <w:rFonts w:ascii="Calibri" w:hAnsi="Calibri" w:cs="Calibri"/>
+                <w:b w:val="0"/>
+                <w:color w:val="334155"/>
+                <w:sz w:val="16"/>
+              </w:rPr>
+              <w:t>Atila · ~5–6 min verified</w:t>
+            </w:r>
+          </w:p>
+        </w:tc>
+      </w:tr>
+      <w:tr>
+        <w:tc>
+          <w:tcPr>
+            <w:tcW w:type="dxa" w:w="1176"/>
+          </w:tcPr>
+          <w:p>
+            <w:r>
+              <w:rPr>
+                <w:rFonts w:ascii="Calibri" w:hAnsi="Calibri" w:cs="Calibri"/>
+                <w:b w:val="0"/>
+                <w:color w:val="334155"/>
+                <w:sz w:val="16"/>
+              </w:rPr>
+              <w:t>Type-Safe TS with Type Narrowing (Rainer Hahnekamp)</w:t>
+            </w:r>
+          </w:p>
+        </w:tc>
+        <w:tc>
+          <w:tcPr>
+            <w:tcW w:type="dxa" w:w="1176"/>
+          </w:tcPr>
+          <w:p>
+            <w:r>
+              <w:rPr>
+                <w:rFonts w:ascii="Calibri" w:hAnsi="Calibri" w:cs="Calibri"/>
+                <w:b w:val="0"/>
+                <w:color w:val="334155"/>
+                <w:sz w:val="16"/>
+              </w:rPr>
+              <w:t>Reference</w:t>
+            </w:r>
+          </w:p>
+        </w:tc>
+        <w:tc>
+          <w:tcPr>
+            <w:tcW w:type="dxa" w:w="1176"/>
+          </w:tcPr>
+          <w:p>
+            <w:r>
+              <w:rPr>
+                <w:rFonts w:ascii="Calibri" w:hAnsi="Calibri" w:cs="Calibri"/>
+                <w:b w:val="0"/>
+                <w:color w:val="334155"/>
+                <w:sz w:val="16"/>
+              </w:rPr>
+              <w:t>Day 2 Runtime validation</w:t>
+            </w:r>
+          </w:p>
+        </w:tc>
+        <w:tc>
+          <w:tcPr>
+            <w:tcW w:type="dxa" w:w="1176"/>
+          </w:tcPr>
+          <w:p>
+            <w:r>
+              <w:rPr>
+                <w:rFonts w:ascii="Calibri" w:hAnsi="Calibri" w:cs="Calibri"/>
+                <w:b w:val="0"/>
+                <w:color w:val="334155"/>
+                <w:sz w:val="16"/>
+              </w:rPr>
+              <w:t>https://www.rainerhahnekamp.com/en/type-safe-typescript-with-type-narrowing/</w:t>
+            </w:r>
+          </w:p>
+        </w:tc>
+        <w:tc>
+          <w:tcPr>
+            <w:tcW w:type="dxa" w:w="1176"/>
+          </w:tcPr>
+          <w:p>
+            <w:r>
+              <w:rPr>
+                <w:rFonts w:ascii="Calibri" w:hAnsi="Calibri" w:cs="Calibri"/>
+                <w:b w:val="0"/>
+                <w:color w:val="334155"/>
+                <w:sz w:val="16"/>
+              </w:rPr>
+              <w:t>No</w:t>
+            </w:r>
+          </w:p>
+        </w:tc>
+        <w:tc>
+          <w:tcPr>
+            <w:tcW w:type="dxa" w:w="1176"/>
+          </w:tcPr>
+          <w:p>
+            <w:r>
+              <w:rPr>
+                <w:rFonts w:ascii="Calibri" w:hAnsi="Calibri" w:cs="Calibri"/>
+                <w:b w:val="0"/>
+                <w:color w:val="334155"/>
+                <w:sz w:val="16"/>
+              </w:rPr>
+            </w:r>
+          </w:p>
+        </w:tc>
+        <w:tc>
+          <w:tcPr>
+            <w:tcW w:type="dxa" w:w="1176"/>
+          </w:tcPr>
+          <w:p>
+            <w:r>
+              <w:rPr>
+                <w:rFonts w:ascii="Calibri" w:hAnsi="Calibri" w:cs="Calibri"/>
+                <w:b w:val="0"/>
+                <w:color w:val="334155"/>
+                <w:sz w:val="16"/>
+              </w:rPr>
+            </w:r>
+          </w:p>
+        </w:tc>
+        <w:tc>
+          <w:tcPr>
+            <w:tcW w:type="dxa" w:w="1176"/>
+          </w:tcPr>
+          <w:p>
+            <w:r>
+              <w:rPr>
+                <w:rFonts w:ascii="Calibri" w:hAnsi="Calibri" w:cs="Calibri"/>
+                <w:b w:val="0"/>
+                <w:color w:val="334155"/>
+                <w:sz w:val="16"/>
+              </w:rPr>
+              <w:t>unknown section; Zod optional only</w:t>
+            </w:r>
+          </w:p>
+        </w:tc>
+      </w:tr>
+      <w:tr>
+        <w:tc>
+          <w:tcPr>
+            <w:tcW w:type="dxa" w:w="1176"/>
+          </w:tcPr>
+          <w:p>
+            <w:r>
+              <w:rPr>
+                <w:rFonts w:ascii="Calibri" w:hAnsi="Calibri" w:cs="Calibri"/>
+                <w:b w:val="0"/>
+                <w:color w:val="334155"/>
+                <w:sz w:val="16"/>
+              </w:rPr>
+              <w:t>OpenAI Structured Outputs guide</w:t>
+            </w:r>
+          </w:p>
+        </w:tc>
+        <w:tc>
+          <w:tcPr>
+            <w:tcW w:type="dxa" w:w="1176"/>
+          </w:tcPr>
+          <w:p>
+            <w:r>
+              <w:rPr>
+                <w:rFonts w:ascii="Calibri" w:hAnsi="Calibri" w:cs="Calibri"/>
+                <w:b w:val="0"/>
+                <w:color w:val="334155"/>
+                <w:sz w:val="16"/>
+              </w:rPr>
+              <w:t>Official Docs</w:t>
+            </w:r>
+          </w:p>
+        </w:tc>
+        <w:tc>
+          <w:tcPr>
+            <w:tcW w:type="dxa" w:w="1176"/>
+          </w:tcPr>
+          <w:p>
+            <w:r>
+              <w:rPr>
+                <w:rFonts w:ascii="Calibri" w:hAnsi="Calibri" w:cs="Calibri"/>
+                <w:b w:val="0"/>
+                <w:color w:val="334155"/>
+                <w:sz w:val="16"/>
+              </w:rPr>
+              <w:t>Day 2 AI concept</w:t>
+            </w:r>
+          </w:p>
+        </w:tc>
+        <w:tc>
+          <w:tcPr>
+            <w:tcW w:type="dxa" w:w="1176"/>
+          </w:tcPr>
+          <w:p>
+            <w:r>
+              <w:rPr>
+                <w:rFonts w:ascii="Calibri" w:hAnsi="Calibri" w:cs="Calibri"/>
+                <w:b w:val="0"/>
+                <w:color w:val="334155"/>
+                <w:sz w:val="16"/>
+              </w:rPr>
+              <w:t>https://developers.openai.com/api/docs/guides/structured-outputs</w:t>
+            </w:r>
+          </w:p>
+        </w:tc>
+        <w:tc>
+          <w:tcPr>
+            <w:tcW w:type="dxa" w:w="1176"/>
+          </w:tcPr>
+          <w:p>
+            <w:r>
+              <w:rPr>
+                <w:rFonts w:ascii="Calibri" w:hAnsi="Calibri" w:cs="Calibri"/>
+                <w:b w:val="0"/>
+                <w:color w:val="334155"/>
+                <w:sz w:val="16"/>
+              </w:rPr>
+              <w:t>No</w:t>
+            </w:r>
+          </w:p>
+        </w:tc>
+        <w:tc>
+          <w:tcPr>
+            <w:tcW w:type="dxa" w:w="1176"/>
+          </w:tcPr>
+          <w:p>
+            <w:r>
+              <w:rPr>
+                <w:rFonts w:ascii="Calibri" w:hAnsi="Calibri" w:cs="Calibri"/>
+                <w:b w:val="0"/>
+                <w:color w:val="334155"/>
+                <w:sz w:val="16"/>
+              </w:rPr>
+            </w:r>
+          </w:p>
+        </w:tc>
+        <w:tc>
+          <w:tcPr>
+            <w:tcW w:type="dxa" w:w="1176"/>
+          </w:tcPr>
+          <w:p>
+            <w:r>
+              <w:rPr>
+                <w:rFonts w:ascii="Calibri" w:hAnsi="Calibri" w:cs="Calibri"/>
+                <w:b w:val="0"/>
+                <w:color w:val="334155"/>
+                <w:sz w:val="16"/>
+              </w:rPr>
+            </w:r>
+          </w:p>
+        </w:tc>
+        <w:tc>
+          <w:tcPr>
+            <w:tcW w:type="dxa" w:w="1176"/>
+          </w:tcPr>
+          <w:p>
+            <w:r>
+              <w:rPr>
+                <w:rFonts w:ascii="Calibri" w:hAnsi="Calibri" w:cs="Calibri"/>
+                <w:b w:val="0"/>
+                <w:color w:val="334155"/>
+                <w:sz w:val="16"/>
+              </w:rPr>
+              <w:t>Skim only — still validate as unknown</w:t>
+            </w:r>
+          </w:p>
+        </w:tc>
+      </w:tr>
+      <w:tr>
+        <w:tc>
+          <w:tcPr>
+            <w:tcW w:type="dxa" w:w="1176"/>
+          </w:tcPr>
+          <w:p>
+            <w:r>
+              <w:rPr>
+                <w:rFonts w:ascii="Calibri" w:hAnsi="Calibri" w:cs="Calibri"/>
+                <w:b w:val="0"/>
+                <w:color w:val="334155"/>
+                <w:sz w:val="16"/>
+              </w:rPr>
+              <w:t>LeetCode 560 Subarray Sum Equals K</w:t>
+            </w:r>
+          </w:p>
+        </w:tc>
+        <w:tc>
+          <w:tcPr>
+            <w:tcW w:type="dxa" w:w="1176"/>
+          </w:tcPr>
+          <w:p>
+            <w:r>
+              <w:rPr>
+                <w:rFonts w:ascii="Calibri" w:hAnsi="Calibri" w:cs="Calibri"/>
+                <w:b w:val="0"/>
+                <w:color w:val="334155"/>
+                <w:sz w:val="16"/>
+              </w:rPr>
+              <w:t>Practice</w:t>
+            </w:r>
+          </w:p>
+        </w:tc>
+        <w:tc>
+          <w:tcPr>
+            <w:tcW w:type="dxa" w:w="1176"/>
+          </w:tcPr>
+          <w:p>
+            <w:r>
+              <w:rPr>
+                <w:rFonts w:ascii="Calibri" w:hAnsi="Calibri" w:cs="Calibri"/>
+                <w:b w:val="0"/>
+                <w:color w:val="334155"/>
+                <w:sz w:val="16"/>
+              </w:rPr>
+              <w:t>Day 1 DSA Hashing</w:t>
+            </w:r>
+          </w:p>
+        </w:tc>
+        <w:tc>
+          <w:tcPr>
+            <w:tcW w:type="dxa" w:w="1176"/>
+          </w:tcPr>
+          <w:p>
+            <w:r>
+              <w:rPr>
+                <w:rFonts w:ascii="Calibri" w:hAnsi="Calibri" w:cs="Calibri"/>
+                <w:b w:val="0"/>
+                <w:color w:val="334155"/>
+                <w:sz w:val="16"/>
+              </w:rPr>
+              <w:t>https://leetcode.com/problems/subarray-sum-equals-k/</w:t>
+            </w:r>
+          </w:p>
+        </w:tc>
+        <w:tc>
+          <w:tcPr>
+            <w:tcW w:type="dxa" w:w="1176"/>
+          </w:tcPr>
+          <w:p>
+            <w:r>
+              <w:rPr>
+                <w:rFonts w:ascii="Calibri" w:hAnsi="Calibri" w:cs="Calibri"/>
+                <w:b w:val="0"/>
+                <w:color w:val="334155"/>
+                <w:sz w:val="16"/>
+              </w:rPr>
+              <w:t>No</w:t>
+            </w:r>
+          </w:p>
+        </w:tc>
+        <w:tc>
+          <w:tcPr>
+            <w:tcW w:type="dxa" w:w="1176"/>
+          </w:tcPr>
+          <w:p>
+            <w:r>
+              <w:rPr>
+                <w:rFonts w:ascii="Calibri" w:hAnsi="Calibri" w:cs="Calibri"/>
+                <w:b w:val="0"/>
+                <w:color w:val="334155"/>
+                <w:sz w:val="16"/>
+              </w:rPr>
+            </w:r>
+          </w:p>
+        </w:tc>
+        <w:tc>
+          <w:tcPr>
+            <w:tcW w:type="dxa" w:w="1176"/>
+          </w:tcPr>
+          <w:p>
+            <w:r>
+              <w:rPr>
+                <w:rFonts w:ascii="Calibri" w:hAnsi="Calibri" w:cs="Calibri"/>
+                <w:b w:val="0"/>
+                <w:color w:val="334155"/>
+                <w:sz w:val="16"/>
+              </w:rPr>
+            </w:r>
+          </w:p>
+        </w:tc>
+        <w:tc>
+          <w:tcPr>
+            <w:tcW w:type="dxa" w:w="1176"/>
+          </w:tcPr>
+          <w:p>
+            <w:r>
+              <w:rPr>
+                <w:rFonts w:ascii="Calibri" w:hAnsi="Calibri" w:cs="Calibri"/>
+                <w:b w:val="0"/>
+                <w:color w:val="334155"/>
+                <w:sz w:val="16"/>
+              </w:rPr>
+              <w:t>No editorial first</w:t>
+            </w:r>
+          </w:p>
+        </w:tc>
+      </w:tr>
+      <w:tr>
+        <w:tc>
+          <w:tcPr>
+            <w:tcW w:type="dxa" w:w="1176"/>
+          </w:tcPr>
+          <w:p>
+            <w:r>
+              <w:rPr>
+                <w:rFonts w:ascii="Calibri" w:hAnsi="Calibri" w:cs="Calibri"/>
+                <w:b w:val="0"/>
+                <w:color w:val="334155"/>
+                <w:sz w:val="16"/>
+              </w:rPr>
+              <w:t>LeetCode 739 Daily Temperatures</w:t>
+            </w:r>
+          </w:p>
+        </w:tc>
+        <w:tc>
+          <w:tcPr>
+            <w:tcW w:type="dxa" w:w="1176"/>
+          </w:tcPr>
+          <w:p>
+            <w:r>
+              <w:rPr>
+                <w:rFonts w:ascii="Calibri" w:hAnsi="Calibri" w:cs="Calibri"/>
+                <w:b w:val="0"/>
+                <w:color w:val="334155"/>
+                <w:sz w:val="16"/>
+              </w:rPr>
+              <w:t>Practice</w:t>
+            </w:r>
+          </w:p>
+        </w:tc>
+        <w:tc>
+          <w:tcPr>
+            <w:tcW w:type="dxa" w:w="1176"/>
+          </w:tcPr>
+          <w:p>
+            <w:r>
+              <w:rPr>
+                <w:rFonts w:ascii="Calibri" w:hAnsi="Calibri" w:cs="Calibri"/>
+                <w:b w:val="0"/>
+                <w:color w:val="334155"/>
+                <w:sz w:val="16"/>
+              </w:rPr>
+              <w:t>Day 2 DSA Stack</w:t>
+            </w:r>
+          </w:p>
+        </w:tc>
+        <w:tc>
+          <w:tcPr>
+            <w:tcW w:type="dxa" w:w="1176"/>
+          </w:tcPr>
+          <w:p>
+            <w:r>
+              <w:rPr>
+                <w:rFonts w:ascii="Calibri" w:hAnsi="Calibri" w:cs="Calibri"/>
+                <w:b w:val="0"/>
+                <w:color w:val="334155"/>
+                <w:sz w:val="16"/>
+              </w:rPr>
+              <w:t>https://leetcode.com/problems/daily-temperatures/</w:t>
+            </w:r>
+          </w:p>
+        </w:tc>
+        <w:tc>
+          <w:tcPr>
+            <w:tcW w:type="dxa" w:w="1176"/>
+          </w:tcPr>
+          <w:p>
+            <w:r>
+              <w:rPr>
+                <w:rFonts w:ascii="Calibri" w:hAnsi="Calibri" w:cs="Calibri"/>
+                <w:b w:val="0"/>
+                <w:color w:val="334155"/>
+                <w:sz w:val="16"/>
+              </w:rPr>
+              <w:t>No</w:t>
+            </w:r>
+          </w:p>
+        </w:tc>
+        <w:tc>
+          <w:tcPr>
+            <w:tcW w:type="dxa" w:w="1176"/>
+          </w:tcPr>
+          <w:p>
+            <w:r>
+              <w:rPr>
+                <w:rFonts w:ascii="Calibri" w:hAnsi="Calibri" w:cs="Calibri"/>
+                <w:b w:val="0"/>
+                <w:color w:val="334155"/>
+                <w:sz w:val="16"/>
+              </w:rPr>
+            </w:r>
+          </w:p>
+        </w:tc>
+        <w:tc>
+          <w:tcPr>
+            <w:tcW w:type="dxa" w:w="1176"/>
+          </w:tcPr>
+          <w:p>
+            <w:r>
+              <w:rPr>
+                <w:rFonts w:ascii="Calibri" w:hAnsi="Calibri" w:cs="Calibri"/>
+                <w:b w:val="0"/>
+                <w:color w:val="334155"/>
+                <w:sz w:val="16"/>
+              </w:rPr>
+            </w:r>
+          </w:p>
+        </w:tc>
+        <w:tc>
+          <w:tcPr>
+            <w:tcW w:type="dxa" w:w="1176"/>
+          </w:tcPr>
+          <w:p>
+            <w:r>
+              <w:rPr>
+                <w:rFonts w:ascii="Calibri" w:hAnsi="Calibri" w:cs="Calibri"/>
+                <w:b w:val="0"/>
+                <w:color w:val="334155"/>
+                <w:sz w:val="16"/>
+              </w:rPr>
+              <w:t>No editorial first</w:t>
+            </w:r>
+          </w:p>
+        </w:tc>
+      </w:tr>
+    </w:tbl>
+    <w:p>
+      <w:pPr>
+        <w:pStyle w:val="Heading2"/>
+      </w:pPr>
+      <w:r>
+        <w:rPr>
+          <w:rFonts w:ascii="Calibri" w:hAnsi="Calibri" w:cs="Calibri"/>
+          <w:b/>
+          <w:color w:val="1B365D"/>
+          <w:sz w:val="28"/>
+        </w:rPr>
+        <w:t>Deep Dive Mode (idle)</w:t>
+      </w:r>
+    </w:p>
+    <w:p>
+      <w:pPr/>
+      <w:r>
+        <w:rPr>
+          <w:rFonts w:ascii="Calibri" w:hAnsi="Calibri" w:cs="Calibri"/>
+          <w:b w:val="0"/>
+          <w:i w:val="0"/>
+          <w:color w:val="334155"/>
+          <w:sz w:val="22"/>
+        </w:rPr>
+        <w:t>Activated only when the learner explicitly asks to deep-dive / master a topic. Tree: TOPIC → PREREQUISITES → FUNDAMENTALS → INTERNALS → IMPLEMENTATION → PRODUCTION → PERFORMANCE → SECURITY → COMMON MISTAKES → DEBUGGING → SYSTEM DESIGN → INTERVIEW → FORGEBOARD APPLICATION. Do not auto-return to Daily Mode until the learner says the deep-dive objective is done.</w:t>
+      </w:r>
+    </w:p>
+    <w:p>
+      <w:pPr>
+        <w:pStyle w:val="Heading1"/>
         <w:spacing w:before="320" w:after="160"/>
       </w:pPr>
       <w:r>
@@ -21233,6 +24667,19 @@
         <w:t>Updated: 2026-09-10 — Day 2 appended (runtime validation). Day 1 entry preserved verbatim. Backup taken before write.</w:t>
       </w:r>
     </w:p>
+    <w:p>
+      <w:pPr>
+        <w:pStyle w:val="ListBullet"/>
+      </w:pPr>
+      <w:r>
+        <w:rPr>
+          <w:rFonts w:ascii="Calibri" w:hAnsi="Calibri" w:cs="Calibri"/>
+          <w:color w:val="334155"/>
+          <w:sz w:val="22"/>
+        </w:rPr>
+        <w:t>Updated: 2026-09-10 — Section 0 Learning Dashboard + charts added; Day 1/2 LEARNING RESOURCES added; Section 11 Resources Log added. No new numbered day (calendar-day rule). Day 1 &amp; Day 2 entries preserved.</w:t>
+      </w:r>
+    </w:p>
     <w:sectPr>
       <w:headerReference w:type="default" r:id="rId9"/>
       <w:footerReference w:type="default" r:id="rId10"/>
@@ -21302,7 +24749,7 @@
         <w:color w:val="0F766E"/>
         <w:sz w:val="18"/>
       </w:rPr>
-      <w:t>CONFIDENTIAL LEARNING JOURNAL  ·  Updated 10 Sep 2026 (Day 2)</w:t>
+      <w:t>CONFIDENTIAL LEARNING JOURNAL  ·  Updated 10 Sep 2026 (Dashboard + Resources)</w:t>
     </w:r>
   </w:p>
 </w:hdr>

</xml_diff>